<commit_message>
Protocoll - Use Case
</commit_message>
<xml_diff>
--- a/Documentation_Final_HandIn.docx
+++ b/Documentation_Final_HandIn.docx
@@ -104,13 +104,14 @@
       </w:pPr>
       <w:r>
         <w:lastRenderedPageBreak/>
-        <w:t xml:space="preserve">Link zu </w:t>
-      </w:r>
-      <w:proofErr w:type="spellStart"/>
-      <w:r>
-        <w:t>Git</w:t>
-      </w:r>
-      <w:proofErr w:type="spellEnd"/>
+        <w:t xml:space="preserve">Link </w:t>
+      </w:r>
+      <w:r>
+        <w:t>to</w:t>
+      </w:r>
+      <w:r>
+        <w:t xml:space="preserve"> Git</w:t>
+      </w:r>
     </w:p>
     <w:p>
       <w:hyperlink r:id="rId5" w:history="1">
@@ -140,21 +141,7 @@
         <w:rPr>
           <w:lang w:val="en-US"/>
         </w:rPr>
-        <w:t xml:space="preserve">To use the </w:t>
-      </w:r>
-      <w:proofErr w:type="gramStart"/>
-      <w:r>
-        <w:rPr>
-          <w:lang w:val="en-US"/>
-        </w:rPr>
-        <w:t>application</w:t>
-      </w:r>
-      <w:proofErr w:type="gramEnd"/>
-      <w:r>
-        <w:rPr>
-          <w:lang w:val="en-US"/>
-        </w:rPr>
-        <w:t xml:space="preserve"> you need to:</w:t>
+        <w:t>To use the application you need to:</w:t>
       </w:r>
     </w:p>
     <w:p>
@@ -171,35 +158,7 @@
         <w:rPr>
           <w:lang w:val="en-US"/>
         </w:rPr>
-        <w:t xml:space="preserve">create a .env file </w:t>
-      </w:r>
-      <w:proofErr w:type="gramStart"/>
-      <w:r>
-        <w:rPr>
-          <w:lang w:val="en-US"/>
-        </w:rPr>
-        <w:t>in</w:t>
-      </w:r>
-      <w:proofErr w:type="gramEnd"/>
-      <w:r>
-        <w:rPr>
-          <w:lang w:val="en-US"/>
-        </w:rPr>
-        <w:t xml:space="preserve"> the root of </w:t>
-      </w:r>
-      <w:proofErr w:type="spellStart"/>
-      <w:r>
-        <w:rPr>
-          <w:lang w:val="en-US"/>
-        </w:rPr>
-        <w:t>tourplanner</w:t>
-      </w:r>
-      <w:proofErr w:type="spellEnd"/>
-      <w:r>
-        <w:rPr>
-          <w:lang w:val="en-US"/>
-        </w:rPr>
-        <w:t>-backend. In this .env file save OPEN_ROUTE_SERVICE_API_KEY=/</w:t>
+        <w:t>create a .env file in the root of tourplanner-backend. In this .env file save OPEN_ROUTE_SERVICE_API_KEY=/</w:t>
       </w:r>
       <w:r>
         <w:rPr>
@@ -444,48 +403,32 @@
         <w:rPr>
           <w:lang w:val="en-US"/>
         </w:rPr>
-        <w:t xml:space="preserve">To track Lenas time we counted the commits to </w:t>
-      </w:r>
-      <w:proofErr w:type="spellStart"/>
-      <w:r>
-        <w:rPr>
-          <w:lang w:val="en-US"/>
-        </w:rPr>
-        <w:t>github</w:t>
-      </w:r>
-      <w:proofErr w:type="spellEnd"/>
-      <w:r>
-        <w:rPr>
-          <w:lang w:val="en-US"/>
-        </w:rPr>
-        <w:t xml:space="preserve"> and calculated a half hour per commit (since this was about the average time per commit) I then added around 10 hours for meetings in which we discussed how to proceed</w:t>
-      </w:r>
-    </w:p>
-    <w:p>
-      <w:pPr>
-        <w:rPr>
-          <w:lang w:val="en-US"/>
-        </w:rPr>
-      </w:pPr>
-      <w:r>
-        <w:rPr>
-          <w:lang w:val="en-US"/>
-        </w:rPr>
-        <w:t xml:space="preserve">Commits: 81 </w:t>
-      </w:r>
-      <w:proofErr w:type="spellStart"/>
-      <w:r>
-        <w:rPr>
-          <w:lang w:val="en-US"/>
-        </w:rPr>
-        <w:t>comits</w:t>
-      </w:r>
-      <w:proofErr w:type="spellEnd"/>
-      <w:r>
-        <w:rPr>
-          <w:lang w:val="en-US"/>
-        </w:rPr>
-        <w:t xml:space="preserve"> * 0.5 + 10 = 50,5 hours. </w:t>
+        <w:t>To track Lenas time we counted the commits to github and calculated a half hour per commit (since this was about the average time per commit) I then added around 10 hours for meetings in which we discussed how to proceed</w:t>
+      </w:r>
+    </w:p>
+    <w:p>
+      <w:pPr>
+        <w:rPr>
+          <w:lang w:val="en-US"/>
+        </w:rPr>
+      </w:pPr>
+      <w:r>
+        <w:rPr>
+          <w:lang w:val="en-US"/>
+        </w:rPr>
+        <w:t>Commits: 81 com</w:t>
+      </w:r>
+      <w:r>
+        <w:rPr>
+          <w:lang w:val="en-US"/>
+        </w:rPr>
+        <w:t>m</w:t>
+      </w:r>
+      <w:r>
+        <w:rPr>
+          <w:lang w:val="en-US"/>
+        </w:rPr>
+        <w:t xml:space="preserve">its * 0.5 + 10 = 50,5 hours. </w:t>
       </w:r>
     </w:p>
     <w:p>
@@ -561,62 +504,23 @@
       </w:pPr>
       <w:r>
         <w:rPr>
-          <w:lang w:val="en-US"/>
-        </w:rPr>
-        <w:t xml:space="preserve">For the Architecture in the </w:t>
-      </w:r>
-      <w:proofErr w:type="gramStart"/>
-      <w:r>
-        <w:rPr>
+          <w:rStyle w:val="berschrift2Zchn"/>
           <w:lang w:val="en-US"/>
         </w:rPr>
         <w:t>Backend</w:t>
       </w:r>
-      <w:proofErr w:type="gramEnd"/>
-      <w:r>
-        <w:rPr>
-          <w:lang w:val="en-US"/>
-        </w:rPr>
-        <w:t xml:space="preserve"> we used a Layer-Based-Architecture, with the Layers </w:t>
-      </w:r>
-      <w:r>
-        <w:rPr>
-          <w:lang w:val="en-US"/>
-        </w:rPr>
-        <w:t xml:space="preserve">“Presentation” </w:t>
-      </w:r>
-      <w:r>
-        <w:rPr>
-          <w:lang w:val="en-US"/>
-        </w:rPr>
-        <w:t xml:space="preserve">, “Business” and “Persistence”. </w:t>
-      </w:r>
-    </w:p>
-    <w:p>
-      <w:pPr>
-        <w:rPr>
-          <w:lang w:val="en-US"/>
-        </w:rPr>
-      </w:pPr>
-      <w:r>
-        <w:rPr>
-          <w:lang w:val="en-US"/>
-        </w:rPr>
-        <w:t xml:space="preserve">The Presentation Layer contains things that communicate with the outside world and things that are needed to do so.  For </w:t>
-      </w:r>
-      <w:proofErr w:type="gramStart"/>
-      <w:r>
-        <w:rPr>
-          <w:lang w:val="en-US"/>
-        </w:rPr>
-        <w:t>example</w:t>
-      </w:r>
-      <w:proofErr w:type="gramEnd"/>
-      <w:r>
-        <w:rPr>
-          <w:lang w:val="en-US"/>
-        </w:rPr>
-        <w:t xml:space="preserve"> controllers, DTOs and Mapper. </w:t>
+    </w:p>
+    <w:p>
+      <w:pPr>
+        <w:rPr>
+          <w:lang w:val="en-US"/>
+        </w:rPr>
+      </w:pPr>
+      <w:r>
+        <w:rPr>
+          <w:lang w:val="en-US"/>
+        </w:rPr>
+        <w:t xml:space="preserve">For the Architecture in the Backend we used a Layer-Based-Architecture, with the Layers “Presentation” , “Business” and “Persistence”. </w:t>
       </w:r>
     </w:p>
     <w:p>
@@ -630,6 +534,19 @@
           <w:lang w:val="en-US"/>
         </w:rPr>
         <w:lastRenderedPageBreak/>
+        <w:t xml:space="preserve">The Presentation Layer contains things that communicate with the outside world and things that are needed to do so.  For example controllers, DTOs and Mapper. </w:t>
+      </w:r>
+    </w:p>
+    <w:p>
+      <w:pPr>
+        <w:rPr>
+          <w:lang w:val="en-US"/>
+        </w:rPr>
+      </w:pPr>
+      <w:r>
+        <w:rPr>
+          <w:lang w:val="en-US"/>
+        </w:rPr>
         <w:t xml:space="preserve">The Business Layer contains our internal Business Logic, such es the services. And the Persistence Layer contains our internal Data Structures, which double as the entities that are saved to the database. The Persistence Layer also contains the repositories which are the “gateway” to the database. Apart from these Layers we also have the integration-directory, which contains a façade to communicate with the Open Route Service API. And a Config-Directory, which is used to make “secret” parts of the Application available. </w:t>
       </w:r>
     </w:p>
@@ -641,6 +558,7 @@
       </w:pPr>
       <w:r>
         <w:rPr>
+          <w:noProof/>
           <w:lang w:val="en-US"/>
         </w:rPr>
         <w:drawing>
@@ -687,6 +605,20 @@
     </w:p>
     <w:p>
       <w:pPr>
+        <w:pStyle w:val="berschrift2"/>
+        <w:rPr>
+          <w:lang w:val="en-US"/>
+        </w:rPr>
+      </w:pPr>
+      <w:r>
+        <w:rPr>
+          <w:lang w:val="en-US"/>
+        </w:rPr>
+        <w:t>Frontend</w:t>
+      </w:r>
+    </w:p>
+    <w:p>
+      <w:pPr>
         <w:rPr>
           <w:lang w:val="en-US"/>
         </w:rPr>
@@ -719,6 +651,7 @@
       </w:pPr>
       <w:r>
         <w:rPr>
+          <w:noProof/>
           <w:lang w:val="en-US"/>
         </w:rPr>
         <w:drawing>
@@ -773,21 +706,7 @@
         <w:rPr>
           <w:lang w:val="en-US"/>
         </w:rPr>
-        <w:t>The .</w:t>
-      </w:r>
-      <w:proofErr w:type="spellStart"/>
-      <w:r>
-        <w:rPr>
-          <w:lang w:val="en-US"/>
-        </w:rPr>
-        <w:t>ts</w:t>
-      </w:r>
-      <w:proofErr w:type="spellEnd"/>
-      <w:r>
-        <w:rPr>
-          <w:lang w:val="en-US"/>
-        </w:rPr>
-        <w:t xml:space="preserve"> files of the components act as the View Model, which mediates between the View and the Model. </w:t>
+        <w:t xml:space="preserve">The .ts files of the components act as the View Model, which mediates between the View and the Model. </w:t>
       </w:r>
     </w:p>
     <w:p>
@@ -801,6 +720,7 @@
         <w:rPr>
           <w:lang w:val="en-US"/>
         </w:rPr>
+        <w:lastRenderedPageBreak/>
         <w:t>Unique Feature</w:t>
       </w:r>
     </w:p>
@@ -828,7 +748,6 @@
           <w:noProof/>
           <w:lang w:val="en-US"/>
         </w:rPr>
-        <w:lastRenderedPageBreak/>
         <mc:AlternateContent>
           <mc:Choice Requires="wps">
             <w:drawing>
@@ -1083,7 +1002,14 @@
         <w:rPr>
           <w:lang w:val="en-US"/>
         </w:rPr>
-        <w:t>made with the fitting mode of transport, so that the duration is correctly calculated for every step (by foot takes longer than by bike).</w:t>
+        <w:t xml:space="preserve">made with the fitting </w:t>
+      </w:r>
+      <w:r>
+        <w:rPr>
+          <w:lang w:val="en-US"/>
+        </w:rPr>
+        <w:lastRenderedPageBreak/>
+        <w:t>mode of transport, so that the duration is correctly calculated for every step (by foot takes longer than by bike).</w:t>
       </w:r>
     </w:p>
     <w:p>
@@ -1097,7 +1023,6 @@
           <w:noProof/>
           <w:lang w:val="en-US"/>
         </w:rPr>
-        <w:lastRenderedPageBreak/>
         <mc:AlternateContent>
           <mc:Choice Requires="wps">
             <w:drawing>
@@ -1575,124 +1500,46 @@
         <w:rPr>
           <w:lang w:val="en-US"/>
         </w:rPr>
-        <w:t xml:space="preserve">In the front end, a marker is set on the map for every intermediate step that the user has created. And </w:t>
-      </w:r>
-      <w:proofErr w:type="gramStart"/>
-      <w:r>
-        <w:rPr>
-          <w:lang w:val="en-US"/>
-        </w:rPr>
-        <w:t>In</w:t>
-      </w:r>
-      <w:proofErr w:type="gramEnd"/>
-      <w:r>
-        <w:rPr>
-          <w:lang w:val="en-US"/>
-        </w:rPr>
-        <w:t xml:space="preserve"> the steps the mode of transport is marked by text as well as an image. </w:t>
-      </w:r>
-    </w:p>
-    <w:p>
-      <w:pPr>
-        <w:rPr>
-          <w:lang w:val="en-US"/>
-        </w:rPr>
-      </w:pPr>
-      <w:proofErr w:type="gramStart"/>
-      <w:r>
-        <w:rPr>
-          <w:lang w:val="en-US"/>
-        </w:rPr>
-        <w:t>In order to</w:t>
-      </w:r>
-      <w:proofErr w:type="gramEnd"/>
-      <w:r>
-        <w:rPr>
-          <w:lang w:val="en-US"/>
-        </w:rPr>
-        <w:t xml:space="preserve"> do </w:t>
-      </w:r>
-      <w:proofErr w:type="gramStart"/>
-      <w:r>
-        <w:rPr>
-          <w:lang w:val="en-US"/>
-        </w:rPr>
-        <w:t>this</w:t>
-      </w:r>
-      <w:proofErr w:type="gramEnd"/>
-      <w:r>
-        <w:rPr>
-          <w:lang w:val="en-US"/>
-        </w:rPr>
-        <w:t xml:space="preserve"> we have separate ways of storing the intermediate steps chosen by the user and the waypoints that we get from Open Route Service.</w:t>
-      </w:r>
-    </w:p>
-    <w:p>
-      <w:pPr>
-        <w:rPr>
-          <w:lang w:val="en-US"/>
-        </w:rPr>
-      </w:pPr>
-      <w:r>
-        <w:rPr>
-          <w:lang w:val="en-US"/>
-        </w:rPr>
-        <w:t xml:space="preserve">A Tour has </w:t>
-      </w:r>
-      <w:proofErr w:type="spellStart"/>
-      <w:r>
-        <w:rPr>
-          <w:lang w:val="en-US"/>
-        </w:rPr>
-        <w:t>TourRoutes</w:t>
-      </w:r>
-      <w:proofErr w:type="spellEnd"/>
-      <w:r>
-        <w:rPr>
-          <w:lang w:val="en-US"/>
-        </w:rPr>
-        <w:t xml:space="preserve"> which correspond with the intermediate step that the user has created. </w:t>
-      </w:r>
-    </w:p>
-    <w:p>
-      <w:pPr>
-        <w:rPr>
-          <w:lang w:val="en-US"/>
-        </w:rPr>
-      </w:pPr>
-      <w:r>
-        <w:rPr>
-          <w:lang w:val="en-US"/>
-        </w:rPr>
-        <w:t xml:space="preserve">And a </w:t>
-      </w:r>
-      <w:proofErr w:type="spellStart"/>
-      <w:r>
-        <w:rPr>
-          <w:lang w:val="en-US"/>
-        </w:rPr>
-        <w:t>TourRoute</w:t>
-      </w:r>
-      <w:proofErr w:type="spellEnd"/>
-      <w:r>
-        <w:rPr>
-          <w:lang w:val="en-US"/>
-        </w:rPr>
-        <w:t xml:space="preserve"> has a List / Array of Coordinates which </w:t>
-      </w:r>
-      <w:proofErr w:type="gramStart"/>
-      <w:r>
-        <w:rPr>
-          <w:lang w:val="en-US"/>
-        </w:rPr>
-        <w:t>contain</w:t>
-      </w:r>
-      <w:proofErr w:type="gramEnd"/>
-      <w:r>
-        <w:rPr>
-          <w:lang w:val="en-US"/>
-        </w:rPr>
-        <w:t xml:space="preserve"> a latitude and a longitude: the waypoints that we get from Open Route Service.</w:t>
+        <w:t xml:space="preserve">In the front end, a marker is set on the map for every intermediate step that the user has created. And In the steps the mode of transport is marked by text as well as an image. </w:t>
+      </w:r>
+    </w:p>
+    <w:p>
+      <w:pPr>
+        <w:rPr>
+          <w:lang w:val="en-US"/>
+        </w:rPr>
+      </w:pPr>
+      <w:r>
+        <w:rPr>
+          <w:lang w:val="en-US"/>
+        </w:rPr>
+        <w:t>In order to do this we have separate ways of storing the intermediate steps chosen by the user and the waypoints that we get from Open Route Service.</w:t>
+      </w:r>
+    </w:p>
+    <w:p>
+      <w:pPr>
+        <w:rPr>
+          <w:lang w:val="en-US"/>
+        </w:rPr>
+      </w:pPr>
+      <w:r>
+        <w:rPr>
+          <w:lang w:val="en-US"/>
+        </w:rPr>
+        <w:t xml:space="preserve">A Tour has TourRoutes which correspond with the intermediate step that the user has created. </w:t>
+      </w:r>
+    </w:p>
+    <w:p>
+      <w:pPr>
+        <w:rPr>
+          <w:lang w:val="en-US"/>
+        </w:rPr>
+      </w:pPr>
+      <w:r>
+        <w:rPr>
+          <w:lang w:val="en-US"/>
+        </w:rPr>
+        <w:t>And a TourRoute has a List / Array of Coordinates which contain a latitude and a longitude: the waypoints that we get from Open Route Service.</w:t>
       </w:r>
     </w:p>
     <w:p>
@@ -1741,9 +1588,24 @@
     <w:p>
       <w:pPr>
         <w:rPr>
-          <w:lang w:val="en-US"/>
-        </w:rPr>
-      </w:pPr>
+          <w:color w:val="EE0000"/>
+          <w:lang w:val="en-US"/>
+        </w:rPr>
+      </w:pPr>
+      <w:r>
+        <w:rPr>
+          <w:color w:val="EE0000"/>
+          <w:lang w:val="en-US"/>
+        </w:rPr>
+        <w:t>???</w:t>
+      </w:r>
+      <w:r>
+        <w:rPr>
+          <w:color w:val="EE0000"/>
+          <w:lang w:val="en-US"/>
+        </w:rPr>
+        <w:t>?</w:t>
+      </w:r>
     </w:p>
     <w:p>
       <w:pPr>
@@ -1845,21 +1707,7 @@
         <w:rPr>
           <w:color w:val="EE0000"/>
         </w:rPr>
-        <w:t xml:space="preserve">neues erstellen mit Front End und </w:t>
-      </w:r>
-      <w:proofErr w:type="gramStart"/>
-      <w:r>
-        <w:rPr>
-          <w:color w:val="EE0000"/>
-        </w:rPr>
-        <w:t>Backend</w:t>
-      </w:r>
-      <w:proofErr w:type="gramEnd"/>
-      <w:r>
-        <w:rPr>
-          <w:color w:val="EE0000"/>
-        </w:rPr>
-        <w:t>??</w:t>
+        <w:t>neues erstellen mit Front End und Backend??</w:t>
       </w:r>
     </w:p>
     <w:p>
@@ -1909,19 +1757,11 @@
           <w:lang w:val="en-US"/>
         </w:rPr>
       </w:pPr>
-      <w:proofErr w:type="spellStart"/>
-      <w:r>
-        <w:rPr>
-          <w:lang w:val="en-US"/>
-        </w:rPr>
-        <w:t>Drawio</w:t>
-      </w:r>
-      <w:proofErr w:type="spellEnd"/>
-      <w:r>
-        <w:rPr>
-          <w:lang w:val="en-US"/>
-        </w:rPr>
-        <w:t xml:space="preserve">-File can be found in the zip. </w:t>
+      <w:r>
+        <w:rPr>
+          <w:lang w:val="en-US"/>
+        </w:rPr>
+        <w:t xml:space="preserve">Drawio-File can be found in the zip. </w:t>
       </w:r>
     </w:p>
     <w:p>
@@ -1955,21 +1795,7 @@
         <w:rPr>
           <w:lang w:val="en-US"/>
         </w:rPr>
-        <w:t xml:space="preserve">The “Personas” we </w:t>
-      </w:r>
-      <w:proofErr w:type="gramStart"/>
-      <w:r>
-        <w:rPr>
-          <w:lang w:val="en-US"/>
-        </w:rPr>
-        <w:t>have,</w:t>
-      </w:r>
-      <w:proofErr w:type="gramEnd"/>
-      <w:r>
-        <w:rPr>
-          <w:lang w:val="en-US"/>
-        </w:rPr>
-        <w:t xml:space="preserve"> that can interact with the system are:</w:t>
+        <w:t>The “Personas” we have, that can interact with the system are:</w:t>
       </w:r>
     </w:p>
     <w:p>
@@ -2035,21 +1861,7 @@
         <w:rPr>
           <w:lang w:val="en-US"/>
         </w:rPr>
-        <w:t xml:space="preserve">e documentation are not supposed to show the actual design, which has been improved since the creation of the Wireframe, but instead </w:t>
-      </w:r>
-      <w:proofErr w:type="gramStart"/>
-      <w:r>
-        <w:rPr>
-          <w:lang w:val="en-US"/>
-        </w:rPr>
-        <w:t>represent</w:t>
-      </w:r>
-      <w:proofErr w:type="gramEnd"/>
-      <w:r>
-        <w:rPr>
-          <w:lang w:val="en-US"/>
-        </w:rPr>
-        <w:t xml:space="preserve"> the flow of the scenarios</w:t>
+        <w:t>e documentation are not supposed to show the actual design, which has been improved since the creation of the Wireframe, but instead represent the flow of the scenarios</w:t>
       </w:r>
     </w:p>
     <w:p>
@@ -2263,19 +2075,11 @@
           <w:lang w:val="en-US"/>
         </w:rPr>
       </w:pPr>
-      <w:proofErr w:type="gramStart"/>
-      <w:r>
-        <w:rPr>
-          <w:lang w:val="en-US"/>
-        </w:rPr>
-        <w:t>However</w:t>
-      </w:r>
-      <w:proofErr w:type="gramEnd"/>
-      <w:r>
-        <w:rPr>
-          <w:lang w:val="en-US"/>
-        </w:rPr>
-        <w:t xml:space="preserve"> we also did not want to just throw the user into a functionality, once they are logged in, which is why we have the dashboard-screen. </w:t>
+      <w:r>
+        <w:rPr>
+          <w:lang w:val="en-US"/>
+        </w:rPr>
+        <w:t xml:space="preserve">However we also did not want to just throw the user into a functionality, once they are logged in, which is why we have the dashboard-screen. </w:t>
       </w:r>
     </w:p>
     <w:p>
@@ -2448,49 +2252,7 @@
         <w:rPr>
           <w:lang w:val="en-US"/>
         </w:rPr>
-        <w:t xml:space="preserve">From the Overview the user can select a Tour by </w:t>
-      </w:r>
-      <w:proofErr w:type="spellStart"/>
-      <w:r>
-        <w:rPr>
-          <w:lang w:val="en-US"/>
-        </w:rPr>
-        <w:t>klicking</w:t>
-      </w:r>
-      <w:proofErr w:type="spellEnd"/>
-      <w:r>
-        <w:rPr>
-          <w:lang w:val="en-US"/>
-        </w:rPr>
-        <w:t xml:space="preserve"> on it and </w:t>
-      </w:r>
-      <w:proofErr w:type="spellStart"/>
-      <w:r>
-        <w:rPr>
-          <w:lang w:val="en-US"/>
-        </w:rPr>
-        <w:t>ist</w:t>
-      </w:r>
-      <w:proofErr w:type="spellEnd"/>
-      <w:r>
-        <w:rPr>
-          <w:lang w:val="en-US"/>
-        </w:rPr>
-        <w:t xml:space="preserve"> navigated to the overview, where they are given the Option to “</w:t>
-      </w:r>
-      <w:proofErr w:type="spellStart"/>
-      <w:r>
-        <w:rPr>
-          <w:lang w:val="en-US"/>
-        </w:rPr>
-        <w:t>Modifiy</w:t>
-      </w:r>
-      <w:proofErr w:type="spellEnd"/>
-      <w:r>
-        <w:rPr>
-          <w:lang w:val="en-US"/>
-        </w:rPr>
-        <w:t>” or “Delete” the Tour</w:t>
+        <w:t>From the Overview the user can select a Tour by klicking on it and ist navigated to the overview, where they are given the Option to “Modifiy” or “Delete” the Tour</w:t>
       </w:r>
     </w:p>
     <w:p>
@@ -2516,21 +2278,7 @@
         <w:rPr>
           <w:lang w:val="en-US"/>
         </w:rPr>
-        <w:t xml:space="preserve">The tour that was the last one to be selected by the user is saved in the App-State. This way the User also has the easy option to navigate to this tour by </w:t>
-      </w:r>
-      <w:proofErr w:type="spellStart"/>
-      <w:r>
-        <w:rPr>
-          <w:lang w:val="en-US"/>
-        </w:rPr>
-        <w:t>klicking</w:t>
-      </w:r>
-      <w:proofErr w:type="spellEnd"/>
-      <w:r>
-        <w:rPr>
-          <w:lang w:val="en-US"/>
-        </w:rPr>
-        <w:t xml:space="preserve"> “latest viewed Tour”. Creating a Tour saves that one to the App-State as the latest selected and navigates to the detail-screen. </w:t>
+        <w:t xml:space="preserve">The tour that was the last one to be selected by the user is saved in the App-State. This way the User also has the easy option to navigate to this tour by klicking “latest viewed Tour”. Creating a Tour saves that one to the App-State as the latest selected and navigates to the detail-screen. </w:t>
       </w:r>
     </w:p>
     <w:p>
@@ -2797,7 +2545,7 @@
         </w:rPr>
         <w:lastRenderedPageBreak/>
         <w:drawing>
-          <wp:anchor distT="0" distB="0" distL="114300" distR="114300" simplePos="0" relativeHeight="251662336" behindDoc="0" locked="0" layoutInCell="1" allowOverlap="1" wp14:anchorId="40BCD063" wp14:editId="553EBA2B">
+          <wp:anchor distT="0" distB="0" distL="114300" distR="114300" simplePos="0" relativeHeight="251662336" behindDoc="0" locked="0" layoutInCell="1" allowOverlap="1" wp14:anchorId="40BCD063" wp14:editId="4534AF80">
             <wp:simplePos x="0" y="0"/>
             <wp:positionH relativeFrom="column">
               <wp:posOffset>-4445</wp:posOffset>
@@ -3304,21 +3052,7 @@
         <w:rPr>
           <w:lang w:val="en-US"/>
         </w:rPr>
-        <w:t xml:space="preserve">For </w:t>
-      </w:r>
-      <w:proofErr w:type="gramStart"/>
-      <w:r>
-        <w:rPr>
-          <w:lang w:val="en-US"/>
-        </w:rPr>
-        <w:t>Example</w:t>
-      </w:r>
-      <w:proofErr w:type="gramEnd"/>
-      <w:r>
-        <w:rPr>
-          <w:lang w:val="en-US"/>
-        </w:rPr>
-        <w:t xml:space="preserve"> in the steps we are displaying the route-type (the transport-mode by which the step is taken) by using icons.</w:t>
+        <w:t>For Example in the steps we are displaying the route-type (the transport-mode by which the step is taken) by using icons.</w:t>
       </w:r>
     </w:p>
     <w:p>
@@ -3463,21 +3197,7 @@
         <w:rPr>
           <w:lang w:val="en-US"/>
         </w:rPr>
-        <w:t xml:space="preserve">Another Example for this </w:t>
-      </w:r>
-      <w:proofErr w:type="gramStart"/>
-      <w:r>
-        <w:rPr>
-          <w:lang w:val="en-US"/>
-        </w:rPr>
-        <w:t>are</w:t>
-      </w:r>
-      <w:proofErr w:type="gramEnd"/>
-      <w:r>
-        <w:rPr>
-          <w:lang w:val="en-US"/>
-        </w:rPr>
-        <w:t xml:space="preserve"> the Buttons:</w:t>
+        <w:t>Another Example for this are the Buttons:</w:t>
       </w:r>
     </w:p>
     <w:p>
@@ -3891,13 +3611,52 @@
           <w:lang w:val="en-US"/>
         </w:rPr>
       </w:pPr>
-    </w:p>
-    <w:p>
-      <w:pPr>
-        <w:rPr>
-          <w:lang w:val="en-US"/>
-        </w:rPr>
-      </w:pPr>
+      <w:r>
+        <w:rPr>
+          <w:noProof/>
+          <w:lang w:val="en-US"/>
+        </w:rPr>
+        <w:drawing>
+          <wp:inline distT="0" distB="0" distL="0" distR="0" wp14:anchorId="616386FE" wp14:editId="60B0D3F0">
+            <wp:extent cx="5760720" cy="2609215"/>
+            <wp:effectExtent l="19050" t="19050" r="11430" b="19685"/>
+            <wp:docPr id="952503955" name="Grafik 1"/>
+            <wp:cNvGraphicFramePr>
+              <a:graphicFrameLocks xmlns:a="http://schemas.openxmlformats.org/drawingml/2006/main" noChangeAspect="1"/>
+            </wp:cNvGraphicFramePr>
+            <a:graphic xmlns:a="http://schemas.openxmlformats.org/drawingml/2006/main">
+              <a:graphicData uri="http://schemas.openxmlformats.org/drawingml/2006/picture">
+                <pic:pic xmlns:pic="http://schemas.openxmlformats.org/drawingml/2006/picture">
+                  <pic:nvPicPr>
+                    <pic:cNvPr id="952503955" name=""/>
+                    <pic:cNvPicPr/>
+                  </pic:nvPicPr>
+                  <pic:blipFill>
+                    <a:blip r:embed="rId29"/>
+                    <a:stretch>
+                      <a:fillRect/>
+                    </a:stretch>
+                  </pic:blipFill>
+                  <pic:spPr>
+                    <a:xfrm>
+                      <a:off x="0" y="0"/>
+                      <a:ext cx="5760720" cy="2609215"/>
+                    </a:xfrm>
+                    <a:prstGeom prst="rect">
+                      <a:avLst/>
+                    </a:prstGeom>
+                    <a:ln>
+                      <a:solidFill>
+                        <a:schemeClr val="accent1"/>
+                      </a:solidFill>
+                    </a:ln>
+                  </pic:spPr>
+                </pic:pic>
+              </a:graphicData>
+            </a:graphic>
+          </wp:inline>
+        </w:drawing>
+      </w:r>
     </w:p>
     <w:p>
       <w:pPr>

</xml_diff>

<commit_message>
added functionality to dashboard tours and howing newest tours first on overview
</commit_message>
<xml_diff>
--- a/Documentation_Final_HandIn.docx
+++ b/Documentation_Final_HandIn.docx
@@ -469,6 +469,59 @@
     </w:p>
     <w:p>
       <w:pPr>
+        <w:rPr>
+          <w:lang w:val="en-US"/>
+        </w:rPr>
+      </w:pPr>
+      <w:r>
+        <w:rPr>
+          <w:lang w:val="en-US"/>
+        </w:rPr>
+        <w:t xml:space="preserve">Start backend application with docker </w:t>
+      </w:r>
+      <w:proofErr w:type="gramStart"/>
+      <w:r>
+        <w:rPr>
+          <w:lang w:val="en-US"/>
+        </w:rPr>
+        <w:t>compose</w:t>
+      </w:r>
+      <w:proofErr w:type="gramEnd"/>
+      <w:r>
+        <w:rPr>
+          <w:lang w:val="en-US"/>
+        </w:rPr>
+        <w:t xml:space="preserve"> up </w:t>
+      </w:r>
+    </w:p>
+    <w:p>
+      <w:pPr>
+        <w:rPr>
+          <w:lang w:val="en-US"/>
+        </w:rPr>
+      </w:pPr>
+      <w:r>
+        <w:rPr>
+          <w:lang w:val="en-US"/>
+        </w:rPr>
+        <w:t>Start frontend application with ng serve</w:t>
+      </w:r>
+    </w:p>
+    <w:p>
+      <w:pPr>
+        <w:rPr>
+          <w:lang w:val="en-US"/>
+        </w:rPr>
+      </w:pPr>
+      <w:r>
+        <w:rPr>
+          <w:lang w:val="en-US"/>
+        </w:rPr>
+        <w:t xml:space="preserve">Swagger is available </w:t>
+      </w:r>
+    </w:p>
+    <w:p>
+      <w:pPr>
         <w:pStyle w:val="berschrift1"/>
         <w:rPr>
           <w:lang w:val="en-US"/>
@@ -543,26 +596,75 @@
         <w:rPr>
           <w:lang w:val="en-US"/>
         </w:rPr>
+        <w:t xml:space="preserve">Lena: </w:t>
+      </w:r>
+      <w:r>
+        <w:rPr>
+          <w:lang w:val="en-US"/>
+        </w:rPr>
+        <w:t>50,5</w:t>
+      </w:r>
+      <w:r>
+        <w:rPr>
+          <w:lang w:val="en-US"/>
+        </w:rPr>
+        <w:t>h</w:t>
+      </w:r>
+    </w:p>
+    <w:p>
+      <w:pPr>
+        <w:rPr>
+          <w:lang w:val="en-US"/>
+        </w:rPr>
+      </w:pPr>
+      <w:r>
+        <w:rPr>
+          <w:lang w:val="en-US"/>
+        </w:rPr>
         <w:t>Yusuf:</w:t>
       </w:r>
       <w:r>
         <w:rPr>
           <w:lang w:val="en-US"/>
         </w:rPr>
-        <w:t xml:space="preserve"> 30h</w:t>
-      </w:r>
-    </w:p>
-    <w:p>
-      <w:pPr>
-        <w:rPr>
-          <w:lang w:val="en-US"/>
-        </w:rPr>
-      </w:pPr>
-      <w:r>
-        <w:rPr>
-          <w:lang w:val="en-US"/>
-        </w:rPr>
-        <w:t>Jasmina: 35h</w:t>
+        <w:t xml:space="preserve"> 3</w:t>
+      </w:r>
+      <w:r>
+        <w:rPr>
+          <w:lang w:val="en-US"/>
+        </w:rPr>
+        <w:t>5</w:t>
+      </w:r>
+      <w:r>
+        <w:rPr>
+          <w:lang w:val="en-US"/>
+        </w:rPr>
+        <w:t>h</w:t>
+      </w:r>
+    </w:p>
+    <w:p>
+      <w:pPr>
+        <w:rPr>
+          <w:lang w:val="en-US"/>
+        </w:rPr>
+      </w:pPr>
+      <w:r>
+        <w:rPr>
+          <w:lang w:val="en-US"/>
+        </w:rPr>
+        <w:t xml:space="preserve">Jasmina: </w:t>
+      </w:r>
+      <w:r>
+        <w:rPr>
+          <w:lang w:val="en-US"/>
+        </w:rPr>
+        <w:t>45</w:t>
+      </w:r>
+      <w:r>
+        <w:rPr>
+          <w:lang w:val="en-US"/>
+        </w:rPr>
+        <w:t>h</w:t>
       </w:r>
     </w:p>
     <w:p>
@@ -577,6 +679,12 @@
         </w:rPr>
         <w:t>Overall time:</w:t>
       </w:r>
+      <w:r>
+        <w:rPr>
+          <w:lang w:val="en-US"/>
+        </w:rPr>
+        <w:t xml:space="preserve"> 130,5h</w:t>
+      </w:r>
     </w:p>
     <w:p>
       <w:pPr>
@@ -589,6 +697,7 @@
         <w:rPr>
           <w:lang w:val="en-US"/>
         </w:rPr>
+        <w:lastRenderedPageBreak/>
         <w:t>App</w:t>
       </w:r>
       <w:r>
@@ -663,7 +772,6 @@
         <w:rPr>
           <w:lang w:val="en-US"/>
         </w:rPr>
-        <w:lastRenderedPageBreak/>
         <w:t xml:space="preserve">The Presentation Layer contains things that communicate with the outside world and things that are needed to do so.  For </w:t>
       </w:r>
       <w:r>
@@ -848,6 +956,7 @@
         <w:rPr>
           <w:lang w:val="en-US"/>
         </w:rPr>
+        <w:lastRenderedPageBreak/>
         <w:t>The .</w:t>
       </w:r>
       <w:proofErr w:type="spellStart"/>
@@ -876,7 +985,6 @@
         <w:rPr>
           <w:lang w:val="en-US"/>
         </w:rPr>
-        <w:lastRenderedPageBreak/>
         <w:t>Unique Feature</w:t>
       </w:r>
     </w:p>
@@ -892,6 +1000,13 @@
         </w:rPr>
         <w:t xml:space="preserve">Our unique feature is the ability to create “Mixed Tours”. Mixed Tours contain multiple steps, and the user can choose a different mode of transport for each step. </w:t>
       </w:r>
+    </w:p>
+    <w:p>
+      <w:pPr>
+        <w:rPr>
+          <w:lang w:val="en-US"/>
+        </w:rPr>
+      </w:pPr>
     </w:p>
     <w:p>
       <w:pPr>
@@ -907,13 +1022,13 @@
         <mc:AlternateContent>
           <mc:Choice Requires="wps">
             <w:drawing>
-              <wp:anchor distT="0" distB="0" distL="114300" distR="114300" simplePos="0" relativeHeight="251665408" behindDoc="0" locked="0" layoutInCell="1" allowOverlap="1" wp14:anchorId="635CAB16" wp14:editId="3D248391">
+              <wp:anchor distT="0" distB="0" distL="114300" distR="114300" simplePos="0" relativeHeight="251665408" behindDoc="0" locked="0" layoutInCell="1" allowOverlap="1" wp14:anchorId="635CAB16" wp14:editId="025AB2A8">
                 <wp:simplePos x="0" y="0"/>
                 <wp:positionH relativeFrom="column">
-                  <wp:posOffset>4956719</wp:posOffset>
+                  <wp:posOffset>4727575</wp:posOffset>
                 </wp:positionH>
                 <wp:positionV relativeFrom="paragraph">
-                  <wp:posOffset>2893151</wp:posOffset>
+                  <wp:posOffset>3033395</wp:posOffset>
                 </wp:positionV>
                 <wp:extent cx="108857" cy="707571"/>
                 <wp:effectExtent l="0" t="0" r="62865" b="54610"/>
@@ -959,11 +1074,11 @@
           </mc:Choice>
           <mc:Fallback>
             <w:pict>
-              <v:shapetype w14:anchorId="41892CAD" id="_x0000_t32" coordsize="21600,21600" o:spt="32" o:oned="t" path="m,l21600,21600e" filled="f">
+              <v:shapetype w14:anchorId="59C6D9E3" id="_x0000_t32" coordsize="21600,21600" o:spt="32" o:oned="t" path="m,l21600,21600e" filled="f">
                 <v:path arrowok="t" fillok="f" o:connecttype="none"/>
                 <o:lock v:ext="edit" shapetype="t"/>
               </v:shapetype>
-              <v:shape id="Gerade Verbindung mit Pfeil 4" o:spid="_x0000_s1026" type="#_x0000_t32" style="position:absolute;margin-left:390.3pt;margin-top:227.8pt;width:8.55pt;height:55.7pt;z-index:251665408;visibility:visible;mso-wrap-style:square;mso-wrap-distance-left:9pt;mso-wrap-distance-top:0;mso-wrap-distance-right:9pt;mso-wrap-distance-bottom:0;mso-position-horizontal:absolute;mso-position-horizontal-relative:text;mso-position-vertical:absolute;mso-position-vertical-relative:text" o:gfxdata="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" strokecolor="#e97132 [3205]" strokeweight=".5pt">
+              <v:shape id="Gerade Verbindung mit Pfeil 4" o:spid="_x0000_s1026" type="#_x0000_t32" style="position:absolute;margin-left:372.25pt;margin-top:238.85pt;width:8.55pt;height:55.7pt;z-index:251665408;visibility:visible;mso-wrap-style:square;mso-wrap-distance-left:9pt;mso-wrap-distance-top:0;mso-wrap-distance-right:9pt;mso-wrap-distance-bottom:0;mso-position-horizontal:absolute;mso-position-horizontal-relative:text;mso-position-vertical:absolute;mso-position-vertical-relative:text" o:gfxdata="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" strokecolor="#e97132 [3205]" strokeweight=".5pt">
                 <v:stroke endarrow="block" joinstyle="miter"/>
               </v:shape>
             </w:pict>
@@ -978,16 +1093,16 @@
         <mc:AlternateContent>
           <mc:Choice Requires="wps">
             <w:drawing>
-              <wp:anchor distT="0" distB="0" distL="114300" distR="114300" simplePos="0" relativeHeight="251664384" behindDoc="0" locked="0" layoutInCell="1" allowOverlap="1" wp14:anchorId="688FB61E" wp14:editId="20F68F47">
+              <wp:anchor distT="0" distB="0" distL="114300" distR="114300" simplePos="0" relativeHeight="251664384" behindDoc="0" locked="0" layoutInCell="1" allowOverlap="1" wp14:anchorId="688FB61E" wp14:editId="1C2BBBDC">
                 <wp:simplePos x="0" y="0"/>
                 <wp:positionH relativeFrom="column">
-                  <wp:posOffset>2387691</wp:posOffset>
+                  <wp:posOffset>2400087</wp:posOffset>
                 </wp:positionH>
                 <wp:positionV relativeFrom="paragraph">
-                  <wp:posOffset>1750151</wp:posOffset>
+                  <wp:posOffset>1736302</wp:posOffset>
                 </wp:positionV>
-                <wp:extent cx="348343" cy="783771"/>
-                <wp:effectExtent l="38100" t="0" r="33020" b="54610"/>
+                <wp:extent cx="535517" cy="897255"/>
+                <wp:effectExtent l="38100" t="0" r="36195" b="55245"/>
                 <wp:wrapNone/>
                 <wp:docPr id="1680913035" name="Gerade Verbindung mit Pfeil 3"/>
                 <wp:cNvGraphicFramePr/>
@@ -998,7 +1113,7 @@
                       <wps:spPr>
                         <a:xfrm flipH="1">
                           <a:off x="0" y="0"/>
-                          <a:ext cx="348343" cy="783771"/>
+                          <a:ext cx="535517" cy="897255"/>
                         </a:xfrm>
                         <a:prstGeom prst="straightConnector1">
                           <a:avLst/>
@@ -1025,12 +1140,18 @@
                     </wps:wsp>
                   </a:graphicData>
                 </a:graphic>
+                <wp14:sizeRelH relativeFrom="margin">
+                  <wp14:pctWidth>0</wp14:pctWidth>
+                </wp14:sizeRelH>
+                <wp14:sizeRelV relativeFrom="margin">
+                  <wp14:pctHeight>0</wp14:pctHeight>
+                </wp14:sizeRelV>
               </wp:anchor>
             </w:drawing>
           </mc:Choice>
           <mc:Fallback>
             <w:pict>
-              <v:shape w14:anchorId="5ED02AF8" id="Gerade Verbindung mit Pfeil 3" o:spid="_x0000_s1026" type="#_x0000_t32" style="position:absolute;margin-left:188pt;margin-top:137.8pt;width:27.45pt;height:61.7pt;flip:x;z-index:251664384;visibility:visible;mso-wrap-style:square;mso-wrap-distance-left:9pt;mso-wrap-distance-top:0;mso-wrap-distance-right:9pt;mso-wrap-distance-bottom:0;mso-position-horizontal:absolute;mso-position-horizontal-relative:text;mso-position-vertical:absolute;mso-position-vertical-relative:text" o:gfxdata="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" strokecolor="#e97132 [3205]" strokeweight=".5pt">
+              <v:shape w14:anchorId="2DB03A6A" id="Gerade Verbindung mit Pfeil 3" o:spid="_x0000_s1026" type="#_x0000_t32" style="position:absolute;margin-left:189pt;margin-top:136.7pt;width:42.15pt;height:70.65pt;flip:x;z-index:251664384;visibility:visible;mso-wrap-style:square;mso-width-percent:0;mso-height-percent:0;mso-wrap-distance-left:9pt;mso-wrap-distance-top:0;mso-wrap-distance-right:9pt;mso-wrap-distance-bottom:0;mso-position-horizontal:absolute;mso-position-horizontal-relative:text;mso-position-vertical:absolute;mso-position-vertical-relative:text;mso-width-percent:0;mso-height-percent:0;mso-width-relative:margin;mso-height-relative:margin" o:gfxdata="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" strokecolor="#e97132 [3205]" strokeweight=".5pt">
                 <v:stroke endarrow="block" joinstyle="miter"/>
               </v:shape>
             </w:pict>
@@ -1039,14 +1160,13 @@
       </w:r>
       <w:r>
         <w:rPr>
-          <w:noProof/>
           <w:lang w:val="en-US"/>
         </w:rPr>
         <w:drawing>
-          <wp:inline distT="0" distB="0" distL="0" distR="0" wp14:anchorId="45EEEEE2" wp14:editId="4F8883E3">
-            <wp:extent cx="5760720" cy="4274185"/>
-            <wp:effectExtent l="19050" t="19050" r="11430" b="12065"/>
-            <wp:docPr id="344292086" name="Grafik 1"/>
+          <wp:inline distT="0" distB="0" distL="0" distR="0" wp14:anchorId="3CB0FDB9" wp14:editId="22AE98DC">
+            <wp:extent cx="5760720" cy="5257165"/>
+            <wp:effectExtent l="0" t="0" r="0" b="635"/>
+            <wp:docPr id="1713422083" name="Grafik 1"/>
             <wp:cNvGraphicFramePr>
               <a:graphicFrameLocks xmlns:a="http://schemas.openxmlformats.org/drawingml/2006/main" noChangeAspect="1"/>
             </wp:cNvGraphicFramePr>
@@ -1054,7 +1174,7 @@
               <a:graphicData uri="http://schemas.openxmlformats.org/drawingml/2006/picture">
                 <pic:pic xmlns:pic="http://schemas.openxmlformats.org/drawingml/2006/picture">
                   <pic:nvPicPr>
-                    <pic:cNvPr id="344292086" name=""/>
+                    <pic:cNvPr id="1713422083" name=""/>
                     <pic:cNvPicPr/>
                   </pic:nvPicPr>
                   <pic:blipFill>
@@ -1066,16 +1186,11 @@
                   <pic:spPr>
                     <a:xfrm>
                       <a:off x="0" y="0"/>
-                      <a:ext cx="5760720" cy="4274185"/>
+                      <a:ext cx="5760720" cy="5257165"/>
                     </a:xfrm>
                     <a:prstGeom prst="rect">
                       <a:avLst/>
                     </a:prstGeom>
-                    <a:ln w="9525">
-                      <a:solidFill>
-                        <a:schemeClr val="accent1"/>
-                      </a:solidFill>
-                    </a:ln>
                   </pic:spPr>
                 </pic:pic>
               </a:graphicData>
@@ -1092,14 +1207,14 @@
       </w:pPr>
       <w:r>
         <w:rPr>
-          <w:noProof/>
-          <w:lang w:val="en-US"/>
-        </w:rPr>
+          <w:lang w:val="en-US"/>
+        </w:rPr>
+        <w:lastRenderedPageBreak/>
         <w:drawing>
-          <wp:inline distT="0" distB="0" distL="0" distR="0" wp14:anchorId="48222735" wp14:editId="0FA1F464">
-            <wp:extent cx="5760720" cy="3358515"/>
-            <wp:effectExtent l="19050" t="19050" r="11430" b="13335"/>
-            <wp:docPr id="1147150278" name="Grafik 1"/>
+          <wp:inline distT="0" distB="0" distL="0" distR="0" wp14:anchorId="5817348F" wp14:editId="19E92C7A">
+            <wp:extent cx="5760720" cy="5686425"/>
+            <wp:effectExtent l="0" t="0" r="0" b="9525"/>
+            <wp:docPr id="241368973" name="Grafik 1"/>
             <wp:cNvGraphicFramePr>
               <a:graphicFrameLocks xmlns:a="http://schemas.openxmlformats.org/drawingml/2006/main" noChangeAspect="1"/>
             </wp:cNvGraphicFramePr>
@@ -1107,7 +1222,7 @@
               <a:graphicData uri="http://schemas.openxmlformats.org/drawingml/2006/picture">
                 <pic:pic xmlns:pic="http://schemas.openxmlformats.org/drawingml/2006/picture">
                   <pic:nvPicPr>
-                    <pic:cNvPr id="1147150278" name=""/>
+                    <pic:cNvPr id="241368973" name=""/>
                     <pic:cNvPicPr/>
                   </pic:nvPicPr>
                   <pic:blipFill>
@@ -1119,16 +1234,11 @@
                   <pic:spPr>
                     <a:xfrm>
                       <a:off x="0" y="0"/>
-                      <a:ext cx="5760720" cy="3358515"/>
+                      <a:ext cx="5760720" cy="5686425"/>
                     </a:xfrm>
                     <a:prstGeom prst="rect">
                       <a:avLst/>
                     </a:prstGeom>
-                    <a:ln>
-                      <a:solidFill>
-                        <a:schemeClr val="accent1"/>
-                      </a:solidFill>
-                    </a:ln>
                   </pic:spPr>
                 </pic:pic>
               </a:graphicData>
@@ -1158,37 +1268,311 @@
         <w:rPr>
           <w:lang w:val="en-US"/>
         </w:rPr>
-        <w:t xml:space="preserve">made with the fitting </w:t>
-      </w:r>
-      <w:r>
-        <w:rPr>
+        <w:t>made with the fitting mode of transport, so that the duration is correctly calculated for every step (by foot takes longer than by bike).</w:t>
+      </w:r>
+    </w:p>
+    <w:p>
+      <w:pPr>
+        <w:rPr>
+          <w:lang w:val="en-US"/>
+        </w:rPr>
+      </w:pPr>
+      <w:r>
+        <w:rPr>
+          <w:noProof/>
           <w:lang w:val="en-US"/>
         </w:rPr>
         <w:lastRenderedPageBreak/>
-        <w:t>mode of transport, so that the duration is correctly calculated for every step (by foot takes longer than by bike).</w:t>
-      </w:r>
-    </w:p>
-    <w:p>
-      <w:pPr>
-        <w:rPr>
-          <w:lang w:val="en-US"/>
-        </w:rPr>
-      </w:pPr>
-      <w:r>
-        <w:rPr>
-          <w:noProof/>
-          <w:lang w:val="en-US"/>
-        </w:rPr>
         <mc:AlternateContent>
           <mc:Choice Requires="wps">
             <w:drawing>
-              <wp:anchor distT="0" distB="0" distL="114300" distR="114300" simplePos="0" relativeHeight="251674624" behindDoc="0" locked="0" layoutInCell="1" allowOverlap="1" wp14:anchorId="731F58B1" wp14:editId="0BB2268C">
+              <wp:anchor distT="0" distB="0" distL="114300" distR="114300" simplePos="0" relativeHeight="251678720" behindDoc="0" locked="0" layoutInCell="1" allowOverlap="1" wp14:anchorId="271D6A6F" wp14:editId="7A101FC5">
                 <wp:simplePos x="0" y="0"/>
                 <wp:positionH relativeFrom="column">
-                  <wp:posOffset>1113972</wp:posOffset>
+                  <wp:posOffset>5112385</wp:posOffset>
                 </wp:positionH>
                 <wp:positionV relativeFrom="paragraph">
-                  <wp:posOffset>1233805</wp:posOffset>
+                  <wp:posOffset>3535045</wp:posOffset>
+                </wp:positionV>
+                <wp:extent cx="130629" cy="283028"/>
+                <wp:effectExtent l="0" t="0" r="60325" b="60325"/>
+                <wp:wrapNone/>
+                <wp:docPr id="155147173" name="Gerade Verbindung mit Pfeil 7"/>
+                <wp:cNvGraphicFramePr/>
+                <a:graphic xmlns:a="http://schemas.openxmlformats.org/drawingml/2006/main">
+                  <a:graphicData uri="http://schemas.microsoft.com/office/word/2010/wordprocessingShape">
+                    <wps:wsp>
+                      <wps:cNvCnPr/>
+                      <wps:spPr>
+                        <a:xfrm>
+                          <a:off x="0" y="0"/>
+                          <a:ext cx="130629" cy="283028"/>
+                        </a:xfrm>
+                        <a:prstGeom prst="straightConnector1">
+                          <a:avLst/>
+                        </a:prstGeom>
+                        <a:ln>
+                          <a:solidFill>
+                            <a:srgbClr val="EE0000"/>
+                          </a:solidFill>
+                          <a:tailEnd type="triangle"/>
+                        </a:ln>
+                      </wps:spPr>
+                      <wps:style>
+                        <a:lnRef idx="1">
+                          <a:schemeClr val="accent1"/>
+                        </a:lnRef>
+                        <a:fillRef idx="0">
+                          <a:schemeClr val="accent1"/>
+                        </a:fillRef>
+                        <a:effectRef idx="0">
+                          <a:schemeClr val="accent1"/>
+                        </a:effectRef>
+                        <a:fontRef idx="minor">
+                          <a:schemeClr val="tx1"/>
+                        </a:fontRef>
+                      </wps:style>
+                      <wps:bodyPr/>
+                    </wps:wsp>
+                  </a:graphicData>
+                </a:graphic>
+              </wp:anchor>
+            </w:drawing>
+          </mc:Choice>
+          <mc:Fallback>
+            <w:pict>
+              <v:shape w14:anchorId="0E6AD2BD" id="Gerade Verbindung mit Pfeil 7" o:spid="_x0000_s1026" type="#_x0000_t32" style="position:absolute;margin-left:402.55pt;margin-top:278.35pt;width:10.3pt;height:22.3pt;z-index:251678720;visibility:visible;mso-wrap-style:square;mso-wrap-distance-left:9pt;mso-wrap-distance-top:0;mso-wrap-distance-right:9pt;mso-wrap-distance-bottom:0;mso-position-horizontal:absolute;mso-position-horizontal-relative:text;mso-position-vertical:absolute;mso-position-vertical-relative:text" o:gfxdata="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" strokecolor="#e00" strokeweight=".5pt">
+                <v:stroke endarrow="block" joinstyle="miter"/>
+              </v:shape>
+            </w:pict>
+          </mc:Fallback>
+        </mc:AlternateContent>
+      </w:r>
+      <w:r>
+        <w:rPr>
+          <w:noProof/>
+          <w:lang w:val="en-US"/>
+        </w:rPr>
+        <mc:AlternateContent>
+          <mc:Choice Requires="wps">
+            <w:drawing>
+              <wp:anchor distT="0" distB="0" distL="114300" distR="114300" simplePos="0" relativeHeight="251676672" behindDoc="0" locked="0" layoutInCell="1" allowOverlap="1" wp14:anchorId="2269CB53" wp14:editId="132D5346">
+                <wp:simplePos x="0" y="0"/>
+                <wp:positionH relativeFrom="column">
+                  <wp:posOffset>5111539</wp:posOffset>
+                </wp:positionH>
+                <wp:positionV relativeFrom="paragraph">
+                  <wp:posOffset>2842260</wp:posOffset>
+                </wp:positionV>
+                <wp:extent cx="130629" cy="283028"/>
+                <wp:effectExtent l="0" t="0" r="60325" b="60325"/>
+                <wp:wrapNone/>
+                <wp:docPr id="997878766" name="Gerade Verbindung mit Pfeil 7"/>
+                <wp:cNvGraphicFramePr/>
+                <a:graphic xmlns:a="http://schemas.openxmlformats.org/drawingml/2006/main">
+                  <a:graphicData uri="http://schemas.microsoft.com/office/word/2010/wordprocessingShape">
+                    <wps:wsp>
+                      <wps:cNvCnPr/>
+                      <wps:spPr>
+                        <a:xfrm>
+                          <a:off x="0" y="0"/>
+                          <a:ext cx="130629" cy="283028"/>
+                        </a:xfrm>
+                        <a:prstGeom prst="straightConnector1">
+                          <a:avLst/>
+                        </a:prstGeom>
+                        <a:ln>
+                          <a:solidFill>
+                            <a:srgbClr val="EE0000"/>
+                          </a:solidFill>
+                          <a:tailEnd type="triangle"/>
+                        </a:ln>
+                      </wps:spPr>
+                      <wps:style>
+                        <a:lnRef idx="1">
+                          <a:schemeClr val="accent1"/>
+                        </a:lnRef>
+                        <a:fillRef idx="0">
+                          <a:schemeClr val="accent1"/>
+                        </a:fillRef>
+                        <a:effectRef idx="0">
+                          <a:schemeClr val="accent1"/>
+                        </a:effectRef>
+                        <a:fontRef idx="minor">
+                          <a:schemeClr val="tx1"/>
+                        </a:fontRef>
+                      </wps:style>
+                      <wps:bodyPr/>
+                    </wps:wsp>
+                  </a:graphicData>
+                </a:graphic>
+              </wp:anchor>
+            </w:drawing>
+          </mc:Choice>
+          <mc:Fallback>
+            <w:pict>
+              <v:shape w14:anchorId="55D8FB42" id="Gerade Verbindung mit Pfeil 7" o:spid="_x0000_s1026" type="#_x0000_t32" style="position:absolute;margin-left:402.5pt;margin-top:223.8pt;width:10.3pt;height:22.3pt;z-index:251676672;visibility:visible;mso-wrap-style:square;mso-wrap-distance-left:9pt;mso-wrap-distance-top:0;mso-wrap-distance-right:9pt;mso-wrap-distance-bottom:0;mso-position-horizontal:absolute;mso-position-horizontal-relative:text;mso-position-vertical:absolute;mso-position-vertical-relative:text" o:gfxdata="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" strokecolor="#e00" strokeweight=".5pt">
+                <v:stroke endarrow="block" joinstyle="miter"/>
+              </v:shape>
+            </w:pict>
+          </mc:Fallback>
+        </mc:AlternateContent>
+      </w:r>
+      <w:r>
+        <w:rPr>
+          <w:noProof/>
+          <w:lang w:val="en-US"/>
+        </w:rPr>
+        <mc:AlternateContent>
+          <mc:Choice Requires="wps">
+            <w:drawing>
+              <wp:anchor distT="0" distB="0" distL="114300" distR="114300" simplePos="0" relativeHeight="251668480" behindDoc="0" locked="0" layoutInCell="1" allowOverlap="1" wp14:anchorId="1758FCE0" wp14:editId="73C01654">
+                <wp:simplePos x="0" y="0"/>
+                <wp:positionH relativeFrom="column">
+                  <wp:posOffset>1875155</wp:posOffset>
+                </wp:positionH>
+                <wp:positionV relativeFrom="paragraph">
+                  <wp:posOffset>2799080</wp:posOffset>
+                </wp:positionV>
+                <wp:extent cx="130629" cy="283028"/>
+                <wp:effectExtent l="0" t="0" r="60325" b="60325"/>
+                <wp:wrapNone/>
+                <wp:docPr id="2026138626" name="Gerade Verbindung mit Pfeil 7"/>
+                <wp:cNvGraphicFramePr/>
+                <a:graphic xmlns:a="http://schemas.openxmlformats.org/drawingml/2006/main">
+                  <a:graphicData uri="http://schemas.microsoft.com/office/word/2010/wordprocessingShape">
+                    <wps:wsp>
+                      <wps:cNvCnPr/>
+                      <wps:spPr>
+                        <a:xfrm>
+                          <a:off x="0" y="0"/>
+                          <a:ext cx="130629" cy="283028"/>
+                        </a:xfrm>
+                        <a:prstGeom prst="straightConnector1">
+                          <a:avLst/>
+                        </a:prstGeom>
+                        <a:ln>
+                          <a:solidFill>
+                            <a:srgbClr val="EE0000"/>
+                          </a:solidFill>
+                          <a:tailEnd type="triangle"/>
+                        </a:ln>
+                      </wps:spPr>
+                      <wps:style>
+                        <a:lnRef idx="1">
+                          <a:schemeClr val="accent1"/>
+                        </a:lnRef>
+                        <a:fillRef idx="0">
+                          <a:schemeClr val="accent1"/>
+                        </a:fillRef>
+                        <a:effectRef idx="0">
+                          <a:schemeClr val="accent1"/>
+                        </a:effectRef>
+                        <a:fontRef idx="minor">
+                          <a:schemeClr val="tx1"/>
+                        </a:fontRef>
+                      </wps:style>
+                      <wps:bodyPr/>
+                    </wps:wsp>
+                  </a:graphicData>
+                </a:graphic>
+              </wp:anchor>
+            </w:drawing>
+          </mc:Choice>
+          <mc:Fallback>
+            <w:pict>
+              <v:shape w14:anchorId="79673F6C" id="Gerade Verbindung mit Pfeil 7" o:spid="_x0000_s1026" type="#_x0000_t32" style="position:absolute;margin-left:147.65pt;margin-top:220.4pt;width:10.3pt;height:22.3pt;z-index:251668480;visibility:visible;mso-wrap-style:square;mso-wrap-distance-left:9pt;mso-wrap-distance-top:0;mso-wrap-distance-right:9pt;mso-wrap-distance-bottom:0;mso-position-horizontal:absolute;mso-position-horizontal-relative:text;mso-position-vertical:absolute;mso-position-vertical-relative:text" o:gfxdata="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" strokecolor="#e00" strokeweight=".5pt">
+                <v:stroke endarrow="block" joinstyle="miter"/>
+              </v:shape>
+            </w:pict>
+          </mc:Fallback>
+        </mc:AlternateContent>
+      </w:r>
+      <w:r>
+        <w:rPr>
+          <w:noProof/>
+          <w:lang w:val="en-US"/>
+        </w:rPr>
+        <mc:AlternateContent>
+          <mc:Choice Requires="wps">
+            <w:drawing>
+              <wp:anchor distT="0" distB="0" distL="114300" distR="114300" simplePos="0" relativeHeight="251672576" behindDoc="0" locked="0" layoutInCell="1" allowOverlap="1" wp14:anchorId="40854ED6" wp14:editId="1067E76D">
+                <wp:simplePos x="0" y="0"/>
+                <wp:positionH relativeFrom="column">
+                  <wp:posOffset>1257300</wp:posOffset>
+                </wp:positionH>
+                <wp:positionV relativeFrom="paragraph">
+                  <wp:posOffset>3296920</wp:posOffset>
+                </wp:positionV>
+                <wp:extent cx="130629" cy="283028"/>
+                <wp:effectExtent l="0" t="0" r="60325" b="60325"/>
+                <wp:wrapNone/>
+                <wp:docPr id="671741341" name="Gerade Verbindung mit Pfeil 7"/>
+                <wp:cNvGraphicFramePr/>
+                <a:graphic xmlns:a="http://schemas.openxmlformats.org/drawingml/2006/main">
+                  <a:graphicData uri="http://schemas.microsoft.com/office/word/2010/wordprocessingShape">
+                    <wps:wsp>
+                      <wps:cNvCnPr/>
+                      <wps:spPr>
+                        <a:xfrm>
+                          <a:off x="0" y="0"/>
+                          <a:ext cx="130629" cy="283028"/>
+                        </a:xfrm>
+                        <a:prstGeom prst="straightConnector1">
+                          <a:avLst/>
+                        </a:prstGeom>
+                        <a:ln>
+                          <a:solidFill>
+                            <a:srgbClr val="EE0000"/>
+                          </a:solidFill>
+                          <a:tailEnd type="triangle"/>
+                        </a:ln>
+                      </wps:spPr>
+                      <wps:style>
+                        <a:lnRef idx="1">
+                          <a:schemeClr val="accent1"/>
+                        </a:lnRef>
+                        <a:fillRef idx="0">
+                          <a:schemeClr val="accent1"/>
+                        </a:fillRef>
+                        <a:effectRef idx="0">
+                          <a:schemeClr val="accent1"/>
+                        </a:effectRef>
+                        <a:fontRef idx="minor">
+                          <a:schemeClr val="tx1"/>
+                        </a:fontRef>
+                      </wps:style>
+                      <wps:bodyPr/>
+                    </wps:wsp>
+                  </a:graphicData>
+                </a:graphic>
+              </wp:anchor>
+            </w:drawing>
+          </mc:Choice>
+          <mc:Fallback>
+            <w:pict>
+              <v:shape w14:anchorId="159B84BF" id="Gerade Verbindung mit Pfeil 7" o:spid="_x0000_s1026" type="#_x0000_t32" style="position:absolute;margin-left:99pt;margin-top:259.6pt;width:10.3pt;height:22.3pt;z-index:251672576;visibility:visible;mso-wrap-style:square;mso-wrap-distance-left:9pt;mso-wrap-distance-top:0;mso-wrap-distance-right:9pt;mso-wrap-distance-bottom:0;mso-position-horizontal:absolute;mso-position-horizontal-relative:text;mso-position-vertical:absolute;mso-position-vertical-relative:text" o:gfxdata="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" strokecolor="#e00" strokeweight=".5pt">
+                <v:stroke endarrow="block" joinstyle="miter"/>
+              </v:shape>
+            </w:pict>
+          </mc:Fallback>
+        </mc:AlternateContent>
+      </w:r>
+      <w:r>
+        <w:rPr>
+          <w:noProof/>
+          <w:lang w:val="en-US"/>
+        </w:rPr>
+        <mc:AlternateContent>
+          <mc:Choice Requires="wps">
+            <w:drawing>
+              <wp:anchor distT="0" distB="0" distL="114300" distR="114300" simplePos="0" relativeHeight="251674624" behindDoc="0" locked="0" layoutInCell="1" allowOverlap="1" wp14:anchorId="731F58B1" wp14:editId="662101F6">
+                <wp:simplePos x="0" y="0"/>
+                <wp:positionH relativeFrom="column">
+                  <wp:posOffset>669290</wp:posOffset>
+                </wp:positionH>
+                <wp:positionV relativeFrom="paragraph">
+                  <wp:posOffset>3640455</wp:posOffset>
                 </wp:positionV>
                 <wp:extent cx="130629" cy="283028"/>
                 <wp:effectExtent l="0" t="0" r="60325" b="60325"/>
@@ -1237,7 +1621,7 @@
           </mc:Choice>
           <mc:Fallback>
             <w:pict>
-              <v:shape w14:anchorId="2C3C5DC0" id="Gerade Verbindung mit Pfeil 7" o:spid="_x0000_s1026" type="#_x0000_t32" style="position:absolute;margin-left:87.7pt;margin-top:97.15pt;width:10.3pt;height:22.3pt;z-index:251674624;visibility:visible;mso-wrap-style:square;mso-wrap-distance-left:9pt;mso-wrap-distance-top:0;mso-wrap-distance-right:9pt;mso-wrap-distance-bottom:0;mso-position-horizontal:absolute;mso-position-horizontal-relative:text;mso-position-vertical:absolute;mso-position-vertical-relative:text" o:gfxdata="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" strokecolor="#e00" strokeweight=".5pt">
+              <v:shape w14:anchorId="33E8D127" id="Gerade Verbindung mit Pfeil 7" o:spid="_x0000_s1026" type="#_x0000_t32" style="position:absolute;margin-left:52.7pt;margin-top:286.65pt;width:10.3pt;height:22.3pt;z-index:251674624;visibility:visible;mso-wrap-style:square;mso-wrap-distance-left:9pt;mso-wrap-distance-top:0;mso-wrap-distance-right:9pt;mso-wrap-distance-bottom:0;mso-position-horizontal:absolute;mso-position-horizontal-relative:text;mso-position-vertical:absolute;mso-position-vertical-relative:text" o:gfxdata="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" strokecolor="#e00" strokeweight=".5pt">
                 <v:stroke endarrow="block" joinstyle="miter"/>
               </v:shape>
             </w:pict>
@@ -1252,223 +1636,7 @@
         <mc:AlternateContent>
           <mc:Choice Requires="wps">
             <w:drawing>
-              <wp:anchor distT="0" distB="0" distL="114300" distR="114300" simplePos="0" relativeHeight="251672576" behindDoc="0" locked="0" layoutInCell="1" allowOverlap="1" wp14:anchorId="40854ED6" wp14:editId="49DB0256">
-                <wp:simplePos x="0" y="0"/>
-                <wp:positionH relativeFrom="column">
-                  <wp:posOffset>711290</wp:posOffset>
-                </wp:positionH>
-                <wp:positionV relativeFrom="paragraph">
-                  <wp:posOffset>852714</wp:posOffset>
-                </wp:positionV>
-                <wp:extent cx="130629" cy="283028"/>
-                <wp:effectExtent l="0" t="0" r="60325" b="60325"/>
-                <wp:wrapNone/>
-                <wp:docPr id="671741341" name="Gerade Verbindung mit Pfeil 7"/>
-                <wp:cNvGraphicFramePr/>
-                <a:graphic xmlns:a="http://schemas.openxmlformats.org/drawingml/2006/main">
-                  <a:graphicData uri="http://schemas.microsoft.com/office/word/2010/wordprocessingShape">
-                    <wps:wsp>
-                      <wps:cNvCnPr/>
-                      <wps:spPr>
-                        <a:xfrm>
-                          <a:off x="0" y="0"/>
-                          <a:ext cx="130629" cy="283028"/>
-                        </a:xfrm>
-                        <a:prstGeom prst="straightConnector1">
-                          <a:avLst/>
-                        </a:prstGeom>
-                        <a:ln>
-                          <a:solidFill>
-                            <a:srgbClr val="EE0000"/>
-                          </a:solidFill>
-                          <a:tailEnd type="triangle"/>
-                        </a:ln>
-                      </wps:spPr>
-                      <wps:style>
-                        <a:lnRef idx="1">
-                          <a:schemeClr val="accent1"/>
-                        </a:lnRef>
-                        <a:fillRef idx="0">
-                          <a:schemeClr val="accent1"/>
-                        </a:fillRef>
-                        <a:effectRef idx="0">
-                          <a:schemeClr val="accent1"/>
-                        </a:effectRef>
-                        <a:fontRef idx="minor">
-                          <a:schemeClr val="tx1"/>
-                        </a:fontRef>
-                      </wps:style>
-                      <wps:bodyPr/>
-                    </wps:wsp>
-                  </a:graphicData>
-                </a:graphic>
-              </wp:anchor>
-            </w:drawing>
-          </mc:Choice>
-          <mc:Fallback>
-            <w:pict>
-              <v:shape w14:anchorId="4C916946" id="Gerade Verbindung mit Pfeil 7" o:spid="_x0000_s1026" type="#_x0000_t32" style="position:absolute;margin-left:56pt;margin-top:67.15pt;width:10.3pt;height:22.3pt;z-index:251672576;visibility:visible;mso-wrap-style:square;mso-wrap-distance-left:9pt;mso-wrap-distance-top:0;mso-wrap-distance-right:9pt;mso-wrap-distance-bottom:0;mso-position-horizontal:absolute;mso-position-horizontal-relative:text;mso-position-vertical:absolute;mso-position-vertical-relative:text" o:gfxdata="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" strokecolor="#e00" strokeweight=".5pt">
-                <v:stroke endarrow="block" joinstyle="miter"/>
-              </v:shape>
-            </w:pict>
-          </mc:Fallback>
-        </mc:AlternateContent>
-      </w:r>
-      <w:r>
-        <w:rPr>
-          <w:noProof/>
-          <w:lang w:val="en-US"/>
-        </w:rPr>
-        <mc:AlternateContent>
-          <mc:Choice Requires="wps">
-            <w:drawing>
-              <wp:anchor distT="0" distB="0" distL="114300" distR="114300" simplePos="0" relativeHeight="251670528" behindDoc="0" locked="0" layoutInCell="1" allowOverlap="1" wp14:anchorId="27121327" wp14:editId="1955638C">
-                <wp:simplePos x="0" y="0"/>
-                <wp:positionH relativeFrom="column">
-                  <wp:posOffset>1691005</wp:posOffset>
-                </wp:positionH>
-                <wp:positionV relativeFrom="paragraph">
-                  <wp:posOffset>254091</wp:posOffset>
-                </wp:positionV>
-                <wp:extent cx="220436" cy="223157"/>
-                <wp:effectExtent l="0" t="0" r="84455" b="62865"/>
-                <wp:wrapNone/>
-                <wp:docPr id="1010932707" name="Gerade Verbindung mit Pfeil 7"/>
-                <wp:cNvGraphicFramePr/>
-                <a:graphic xmlns:a="http://schemas.openxmlformats.org/drawingml/2006/main">
-                  <a:graphicData uri="http://schemas.microsoft.com/office/word/2010/wordprocessingShape">
-                    <wps:wsp>
-                      <wps:cNvCnPr/>
-                      <wps:spPr>
-                        <a:xfrm>
-                          <a:off x="0" y="0"/>
-                          <a:ext cx="220436" cy="223157"/>
-                        </a:xfrm>
-                        <a:prstGeom prst="straightConnector1">
-                          <a:avLst/>
-                        </a:prstGeom>
-                        <a:ln>
-                          <a:solidFill>
-                            <a:srgbClr val="EE0000"/>
-                          </a:solidFill>
-                          <a:tailEnd type="triangle"/>
-                        </a:ln>
-                      </wps:spPr>
-                      <wps:style>
-                        <a:lnRef idx="1">
-                          <a:schemeClr val="accent1"/>
-                        </a:lnRef>
-                        <a:fillRef idx="0">
-                          <a:schemeClr val="accent1"/>
-                        </a:fillRef>
-                        <a:effectRef idx="0">
-                          <a:schemeClr val="accent1"/>
-                        </a:effectRef>
-                        <a:fontRef idx="minor">
-                          <a:schemeClr val="tx1"/>
-                        </a:fontRef>
-                      </wps:style>
-                      <wps:bodyPr/>
-                    </wps:wsp>
-                  </a:graphicData>
-                </a:graphic>
-                <wp14:sizeRelH relativeFrom="margin">
-                  <wp14:pctWidth>0</wp14:pctWidth>
-                </wp14:sizeRelH>
-                <wp14:sizeRelV relativeFrom="margin">
-                  <wp14:pctHeight>0</wp14:pctHeight>
-                </wp14:sizeRelV>
-              </wp:anchor>
-            </w:drawing>
-          </mc:Choice>
-          <mc:Fallback>
-            <w:pict>
-              <v:shape w14:anchorId="557D008A" id="Gerade Verbindung mit Pfeil 7" o:spid="_x0000_s1026" type="#_x0000_t32" style="position:absolute;margin-left:133.15pt;margin-top:20pt;width:17.35pt;height:17.55pt;z-index:251670528;visibility:visible;mso-wrap-style:square;mso-width-percent:0;mso-height-percent:0;mso-wrap-distance-left:9pt;mso-wrap-distance-top:0;mso-wrap-distance-right:9pt;mso-wrap-distance-bottom:0;mso-position-horizontal:absolute;mso-position-horizontal-relative:text;mso-position-vertical:absolute;mso-position-vertical-relative:text;mso-width-percent:0;mso-height-percent:0;mso-width-relative:margin;mso-height-relative:margin" o:gfxdata="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" strokecolor="#e00" strokeweight=".5pt">
-                <v:stroke endarrow="block" joinstyle="miter"/>
-              </v:shape>
-            </w:pict>
-          </mc:Fallback>
-        </mc:AlternateContent>
-      </w:r>
-      <w:r>
-        <w:rPr>
-          <w:noProof/>
-          <w:lang w:val="en-US"/>
-        </w:rPr>
-        <mc:AlternateContent>
-          <mc:Choice Requires="wps">
-            <w:drawing>
-              <wp:anchor distT="0" distB="0" distL="114300" distR="114300" simplePos="0" relativeHeight="251668480" behindDoc="0" locked="0" layoutInCell="1" allowOverlap="1" wp14:anchorId="1758FCE0" wp14:editId="1F4F7AB6">
-                <wp:simplePos x="0" y="0"/>
-                <wp:positionH relativeFrom="column">
-                  <wp:posOffset>1310005</wp:posOffset>
-                </wp:positionH>
-                <wp:positionV relativeFrom="paragraph">
-                  <wp:posOffset>602434</wp:posOffset>
-                </wp:positionV>
-                <wp:extent cx="130629" cy="283028"/>
-                <wp:effectExtent l="0" t="0" r="60325" b="60325"/>
-                <wp:wrapNone/>
-                <wp:docPr id="2026138626" name="Gerade Verbindung mit Pfeil 7"/>
-                <wp:cNvGraphicFramePr/>
-                <a:graphic xmlns:a="http://schemas.openxmlformats.org/drawingml/2006/main">
-                  <a:graphicData uri="http://schemas.microsoft.com/office/word/2010/wordprocessingShape">
-                    <wps:wsp>
-                      <wps:cNvCnPr/>
-                      <wps:spPr>
-                        <a:xfrm>
-                          <a:off x="0" y="0"/>
-                          <a:ext cx="130629" cy="283028"/>
-                        </a:xfrm>
-                        <a:prstGeom prst="straightConnector1">
-                          <a:avLst/>
-                        </a:prstGeom>
-                        <a:ln>
-                          <a:solidFill>
-                            <a:srgbClr val="EE0000"/>
-                          </a:solidFill>
-                          <a:tailEnd type="triangle"/>
-                        </a:ln>
-                      </wps:spPr>
-                      <wps:style>
-                        <a:lnRef idx="1">
-                          <a:schemeClr val="accent1"/>
-                        </a:lnRef>
-                        <a:fillRef idx="0">
-                          <a:schemeClr val="accent1"/>
-                        </a:fillRef>
-                        <a:effectRef idx="0">
-                          <a:schemeClr val="accent1"/>
-                        </a:effectRef>
-                        <a:fontRef idx="minor">
-                          <a:schemeClr val="tx1"/>
-                        </a:fontRef>
-                      </wps:style>
-                      <wps:bodyPr/>
-                    </wps:wsp>
-                  </a:graphicData>
-                </a:graphic>
-              </wp:anchor>
-            </w:drawing>
-          </mc:Choice>
-          <mc:Fallback>
-            <w:pict>
-              <v:shape w14:anchorId="10A98A4F" id="Gerade Verbindung mit Pfeil 7" o:spid="_x0000_s1026" type="#_x0000_t32" style="position:absolute;margin-left:103.15pt;margin-top:47.45pt;width:10.3pt;height:22.3pt;z-index:251668480;visibility:visible;mso-wrap-style:square;mso-wrap-distance-left:9pt;mso-wrap-distance-top:0;mso-wrap-distance-right:9pt;mso-wrap-distance-bottom:0;mso-position-horizontal:absolute;mso-position-horizontal-relative:text;mso-position-vertical:absolute;mso-position-vertical-relative:text" o:gfxdata="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" strokecolor="#e00" strokeweight=".5pt">
-                <v:stroke endarrow="block" joinstyle="miter"/>
-              </v:shape>
-            </w:pict>
-          </mc:Fallback>
-        </mc:AlternateContent>
-      </w:r>
-      <w:r>
-        <w:rPr>
-          <w:noProof/>
-          <w:lang w:val="en-US"/>
-        </w:rPr>
-        <mc:AlternateContent>
-          <mc:Choice Requires="wps">
-            <w:drawing>
-              <wp:anchor distT="0" distB="0" distL="114300" distR="114300" simplePos="0" relativeHeight="251667456" behindDoc="0" locked="0" layoutInCell="1" allowOverlap="1" wp14:anchorId="188A7AD9" wp14:editId="136D10EE">
+              <wp:anchor distT="0" distB="0" distL="114300" distR="114300" simplePos="0" relativeHeight="251667456" behindDoc="0" locked="0" layoutInCell="1" allowOverlap="1" wp14:anchorId="188A7AD9" wp14:editId="4D889411">
                 <wp:simplePos x="0" y="0"/>
                 <wp:positionH relativeFrom="column">
                   <wp:posOffset>5381262</wp:posOffset>
@@ -1530,7 +1698,7 @@
           </mc:Choice>
           <mc:Fallback>
             <w:pict>
-              <v:rect w14:anchorId="03DBE8DB" id="Rechteck 6" o:spid="_x0000_s1026" style="position:absolute;margin-left:423.7pt;margin-top:152pt;width:20.55pt;height:30pt;z-index:251667456;visibility:visible;mso-wrap-style:square;mso-wrap-distance-left:9pt;mso-wrap-distance-top:0;mso-wrap-distance-right:9pt;mso-wrap-distance-bottom:0;mso-position-horizontal:absolute;mso-position-horizontal-relative:text;mso-position-vertical:absolute;mso-position-vertical-relative:text;v-text-anchor:middle" o:gfxdata="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" filled="f" strokecolor="#e00" strokeweight="1pt"/>
+              <v:rect w14:anchorId="46EC9B40" id="Rechteck 6" o:spid="_x0000_s1026" style="position:absolute;margin-left:423.7pt;margin-top:152pt;width:20.55pt;height:30pt;z-index:251667456;visibility:visible;mso-wrap-style:square;mso-wrap-distance-left:9pt;mso-wrap-distance-top:0;mso-wrap-distance-right:9pt;mso-wrap-distance-bottom:0;mso-position-horizontal:absolute;mso-position-horizontal-relative:text;mso-position-vertical:absolute;mso-position-vertical-relative:text;v-text-anchor:middle" o:gfxdata="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" filled="f" strokecolor="#e00" strokeweight="1pt"/>
             </w:pict>
           </mc:Fallback>
         </mc:AlternateContent>
@@ -1601,14 +1769,13 @@
       </w:r>
       <w:r>
         <w:rPr>
-          <w:noProof/>
           <w:lang w:val="en-US"/>
         </w:rPr>
         <w:drawing>
-          <wp:inline distT="0" distB="0" distL="0" distR="0" wp14:anchorId="091D08BC" wp14:editId="0CC07C81">
-            <wp:extent cx="5760720" cy="2372995"/>
-            <wp:effectExtent l="19050" t="19050" r="11430" b="27305"/>
-            <wp:docPr id="95822122" name="Grafik 1"/>
+          <wp:inline distT="0" distB="0" distL="0" distR="0" wp14:anchorId="2CF25873" wp14:editId="11D4FE99">
+            <wp:extent cx="5760720" cy="4920615"/>
+            <wp:effectExtent l="0" t="0" r="0" b="0"/>
+            <wp:docPr id="2095800085" name="Grafik 1"/>
             <wp:cNvGraphicFramePr>
               <a:graphicFrameLocks xmlns:a="http://schemas.openxmlformats.org/drawingml/2006/main" noChangeAspect="1"/>
             </wp:cNvGraphicFramePr>
@@ -1616,7 +1783,7 @@
               <a:graphicData uri="http://schemas.openxmlformats.org/drawingml/2006/picture">
                 <pic:pic xmlns:pic="http://schemas.openxmlformats.org/drawingml/2006/picture">
                   <pic:nvPicPr>
-                    <pic:cNvPr id="95822122" name=""/>
+                    <pic:cNvPr id="2095800085" name=""/>
                     <pic:cNvPicPr/>
                   </pic:nvPicPr>
                   <pic:blipFill>
@@ -1628,16 +1795,11 @@
                   <pic:spPr>
                     <a:xfrm>
                       <a:off x="0" y="0"/>
-                      <a:ext cx="5760720" cy="2372995"/>
+                      <a:ext cx="5760720" cy="4920615"/>
                     </a:xfrm>
                     <a:prstGeom prst="rect">
                       <a:avLst/>
                     </a:prstGeom>
-                    <a:ln>
-                      <a:solidFill>
-                        <a:schemeClr val="accent1"/>
-                      </a:solidFill>
-                    </a:ln>
                   </pic:spPr>
                 </pic:pic>
               </a:graphicData>
@@ -1658,14 +1820,12 @@
         </w:rPr>
         <w:t xml:space="preserve">In the front end, a marker is set on the map for every intermediate step that the user has created. And </w:t>
       </w:r>
-      <w:proofErr w:type="gramStart"/>
-      <w:r>
-        <w:rPr>
-          <w:lang w:val="en-US"/>
-        </w:rPr>
-        <w:t>In</w:t>
-      </w:r>
-      <w:proofErr w:type="gramEnd"/>
+      <w:r>
+        <w:rPr>
+          <w:lang w:val="en-US"/>
+        </w:rPr>
+        <w:t>in</w:t>
+      </w:r>
       <w:r>
         <w:rPr>
           <w:lang w:val="en-US"/>
@@ -1679,28 +1839,24 @@
           <w:lang w:val="en-US"/>
         </w:rPr>
       </w:pPr>
-      <w:proofErr w:type="gramStart"/>
-      <w:r>
-        <w:rPr>
-          <w:lang w:val="en-US"/>
-        </w:rPr>
-        <w:t>In order to</w:t>
-      </w:r>
-      <w:proofErr w:type="gramEnd"/>
+      <w:r>
+        <w:rPr>
+          <w:lang w:val="en-US"/>
+        </w:rPr>
+        <w:t>To</w:t>
+      </w:r>
       <w:r>
         <w:rPr>
           <w:lang w:val="en-US"/>
         </w:rPr>
         <w:t xml:space="preserve"> do </w:t>
       </w:r>
-      <w:proofErr w:type="gramStart"/>
-      <w:r>
-        <w:rPr>
-          <w:lang w:val="en-US"/>
-        </w:rPr>
-        <w:t>this</w:t>
-      </w:r>
-      <w:proofErr w:type="gramEnd"/>
+      <w:r>
+        <w:rPr>
+          <w:lang w:val="en-US"/>
+        </w:rPr>
+        <w:t>this,</w:t>
+      </w:r>
       <w:r>
         <w:rPr>
           <w:lang w:val="en-US"/>
@@ -1761,14 +1917,12 @@
         </w:rPr>
         <w:t xml:space="preserve"> has a List / Array of Coordinates which </w:t>
       </w:r>
-      <w:proofErr w:type="gramStart"/>
-      <w:r>
-        <w:rPr>
-          <w:lang w:val="en-US"/>
-        </w:rPr>
-        <w:t>contain</w:t>
-      </w:r>
-      <w:proofErr w:type="gramEnd"/>
+      <w:r>
+        <w:rPr>
+          <w:lang w:val="en-US"/>
+        </w:rPr>
+        <w:t>contains</w:t>
+      </w:r>
       <w:r>
         <w:rPr>
           <w:lang w:val="en-US"/>
@@ -1894,6 +2048,7 @@
         <w:rPr>
           <w:lang w:val="en-GB"/>
         </w:rPr>
+        <w:lastRenderedPageBreak/>
         <w:t xml:space="preserve">Tests cover both successful execution paths (creating, updating, deleting, retrieving entities) and important failure scenarios such as missing resources, invalid input, unauthorized access, and validation errors. </w:t>
       </w:r>
     </w:p>
@@ -2015,7 +2170,6 @@
         <w:rPr>
           <w:lang w:val="en-GB"/>
         </w:rPr>
-        <w:lastRenderedPageBreak/>
         <w:t>The focus was placed on testing business logic rather than persistence or framework functionality, as Spring Data JPA and the framework itself are assumed to be reliable.</w:t>
       </w:r>
     </w:p>
@@ -2054,110 +2208,165 @@
           <w:bCs/>
           <w:lang w:val="en-GB"/>
         </w:rPr>
-        <w:t>Facade Pattern (main pattern):</w:t>
-      </w:r>
+        <w:t xml:space="preserve">Facade Pattern (main pattern): </w:t>
+      </w:r>
+    </w:p>
+    <w:p>
+      <w:pPr>
+        <w:rPr>
+          <w:lang w:val="en-GB"/>
+        </w:rPr>
+      </w:pPr>
+      <w:r>
+        <w:rPr>
+          <w:lang w:val="en-GB"/>
+        </w:rPr>
+        <w:t xml:space="preserve">We implemented the Facade pattern in three places: </w:t>
+      </w:r>
+      <w:proofErr w:type="spellStart"/>
+      <w:r>
+        <w:rPr>
+          <w:lang w:val="en-GB"/>
+        </w:rPr>
+        <w:t>OpenRouteServiceFacade</w:t>
+      </w:r>
+      <w:proofErr w:type="spellEnd"/>
+      <w:r>
+        <w:rPr>
+          <w:lang w:val="en-GB"/>
+        </w:rPr>
+        <w:t xml:space="preserve"> (backend) encapsulates all communication with the </w:t>
+      </w:r>
+      <w:proofErr w:type="spellStart"/>
+      <w:r>
+        <w:rPr>
+          <w:lang w:val="en-GB"/>
+        </w:rPr>
+        <w:t>OpenRouteService</w:t>
+      </w:r>
+      <w:proofErr w:type="spellEnd"/>
+      <w:r>
+        <w:rPr>
+          <w:lang w:val="en-GB"/>
+        </w:rPr>
+        <w:t xml:space="preserve"> API (geocoding, directions), so services don't need to know about HTTP requests, API keys, or response parsing. </w:t>
+      </w:r>
+      <w:r>
+        <w:rPr>
+          <w:lang w:val="en-GB"/>
+        </w:rPr>
+        <w:br/>
+      </w:r>
+      <w:proofErr w:type="spellStart"/>
+      <w:r>
+        <w:rPr>
+          <w:lang w:val="en-GB"/>
+        </w:rPr>
+        <w:t>BackendFacadeService</w:t>
+      </w:r>
+      <w:proofErr w:type="spellEnd"/>
+      <w:r>
+        <w:rPr>
+          <w:lang w:val="en-GB"/>
+        </w:rPr>
+        <w:t xml:space="preserve"> (frontend) wraps all HTTP calls to our backend, so components and state never use </w:t>
+      </w:r>
+      <w:proofErr w:type="spellStart"/>
+      <w:r>
+        <w:rPr>
+          <w:lang w:val="en-GB"/>
+        </w:rPr>
+        <w:t>HttpClient</w:t>
+      </w:r>
+      <w:proofErr w:type="spellEnd"/>
+      <w:r>
+        <w:rPr>
+          <w:lang w:val="en-GB"/>
+        </w:rPr>
+        <w:t xml:space="preserve"> directly. </w:t>
+      </w:r>
+      <w:r>
+        <w:rPr>
+          <w:lang w:val="en-GB"/>
+        </w:rPr>
+        <w:br/>
+      </w:r>
+      <w:proofErr w:type="spellStart"/>
+      <w:r>
+        <w:rPr>
+          <w:lang w:val="en-GB"/>
+        </w:rPr>
+        <w:t>LeafletFacadeService</w:t>
+      </w:r>
+      <w:proofErr w:type="spellEnd"/>
+      <w:r>
+        <w:rPr>
+          <w:lang w:val="en-GB"/>
+        </w:rPr>
+        <w:t xml:space="preserve"> (frontend) encapsulates the Leaflet library for the map component. This improves testability, keeps dependencies replaceable, and hides complexity behind a simple interface. </w:t>
+      </w:r>
+    </w:p>
+    <w:p>
+      <w:pPr>
+        <w:rPr>
+          <w:lang w:val="en-GB"/>
+        </w:rPr>
+      </w:pPr>
       <w:r>
         <w:rPr>
           <w:b/>
           <w:bCs/>
           <w:lang w:val="en-GB"/>
         </w:rPr>
-        <w:t xml:space="preserve"> </w:t>
-      </w:r>
-    </w:p>
-    <w:p>
-      <w:pPr>
-        <w:rPr>
-          <w:lang w:val="en-GB"/>
-        </w:rPr>
-      </w:pPr>
-      <w:r>
-        <w:rPr>
-          <w:lang w:val="en-GB"/>
-        </w:rPr>
-        <w:t xml:space="preserve">We implemented the Facade pattern in three places: </w:t>
+        <w:t>Repository Pattern:</w:t>
+      </w:r>
+      <w:r>
+        <w:rPr>
+          <w:lang w:val="en-GB"/>
+        </w:rPr>
+        <w:t xml:space="preserve"> Data access is separated from business logic via Spring Data JPA repositories (</w:t>
       </w:r>
       <w:proofErr w:type="spellStart"/>
       <w:r>
         <w:rPr>
           <w:lang w:val="en-GB"/>
         </w:rPr>
-        <w:t>OpenRouteServiceFacade</w:t>
+        <w:t>TourRepository</w:t>
       </w:r>
       <w:proofErr w:type="spellEnd"/>
       <w:r>
         <w:rPr>
           <w:lang w:val="en-GB"/>
         </w:rPr>
-        <w:t xml:space="preserve"> (backend) encapsulates all communication with the </w:t>
+        <w:t xml:space="preserve">, </w:t>
       </w:r>
       <w:proofErr w:type="spellStart"/>
       <w:r>
         <w:rPr>
           <w:lang w:val="en-GB"/>
         </w:rPr>
-        <w:t>OpenRouteService</w:t>
+        <w:t>LogRepository</w:t>
       </w:r>
       <w:proofErr w:type="spellEnd"/>
       <w:r>
         <w:rPr>
           <w:lang w:val="en-GB"/>
         </w:rPr>
-        <w:t xml:space="preserve"> API (geocoding, directions), so services don't need to know about HTTP requests, API keys, or response parsing. </w:t>
-      </w:r>
-      <w:r>
-        <w:rPr>
-          <w:lang w:val="en-GB"/>
-        </w:rPr>
-        <w:br/>
+        <w:t xml:space="preserve">, </w:t>
       </w:r>
       <w:proofErr w:type="spellStart"/>
       <w:r>
         <w:rPr>
           <w:lang w:val="en-GB"/>
         </w:rPr>
-        <w:t>BackendFacadeService</w:t>
+        <w:t>UserRepository</w:t>
       </w:r>
       <w:proofErr w:type="spellEnd"/>
       <w:r>
         <w:rPr>
           <w:lang w:val="en-GB"/>
         </w:rPr>
-        <w:t xml:space="preserve"> (frontend) wraps all HTTP calls to our backend, so components and state never use </w:t>
-      </w:r>
-      <w:proofErr w:type="spellStart"/>
-      <w:r>
-        <w:rPr>
-          <w:lang w:val="en-GB"/>
-        </w:rPr>
-        <w:t>HttpClient</w:t>
-      </w:r>
-      <w:proofErr w:type="spellEnd"/>
-      <w:r>
-        <w:rPr>
-          <w:lang w:val="en-GB"/>
-        </w:rPr>
-        <w:t xml:space="preserve"> directly. </w:t>
-      </w:r>
-      <w:r>
-        <w:rPr>
-          <w:lang w:val="en-GB"/>
-        </w:rPr>
-        <w:br/>
-      </w:r>
-      <w:proofErr w:type="spellStart"/>
-      <w:r>
-        <w:rPr>
-          <w:lang w:val="en-GB"/>
-        </w:rPr>
-        <w:t>LeafletFacadeService</w:t>
-      </w:r>
-      <w:proofErr w:type="spellEnd"/>
-      <w:r>
-        <w:rPr>
-          <w:lang w:val="en-GB"/>
-        </w:rPr>
-        <w:t xml:space="preserve"> (frontend) encapsulates the Leaflet library for the map component. This improves testability, keeps dependencies replaceable, and hides complexity behind a simple interface. </w:t>
+        <w:t xml:space="preserve">). </w:t>
       </w:r>
     </w:p>
     <w:p>
@@ -2172,55 +2381,41 @@
           <w:bCs/>
           <w:lang w:val="en-GB"/>
         </w:rPr>
-        <w:t>Repository Pattern:</w:t>
-      </w:r>
-      <w:r>
-        <w:rPr>
-          <w:lang w:val="en-GB"/>
-        </w:rPr>
-        <w:t xml:space="preserve"> Data access is separated from business logic via Spring Data JPA repositories (</w:t>
+        <w:t>Observer Pattern:</w:t>
+      </w:r>
+      <w:r>
+        <w:rPr>
+          <w:lang w:val="en-GB"/>
+        </w:rPr>
+        <w:t xml:space="preserve"> Angular Signals in the </w:t>
       </w:r>
       <w:proofErr w:type="spellStart"/>
       <w:r>
         <w:rPr>
           <w:lang w:val="en-GB"/>
         </w:rPr>
-        <w:t>TourRepository</w:t>
+        <w:t>AppStateService</w:t>
       </w:r>
       <w:proofErr w:type="spellEnd"/>
       <w:r>
         <w:rPr>
           <w:lang w:val="en-GB"/>
         </w:rPr>
-        <w:t xml:space="preserve">, </w:t>
+        <w:t xml:space="preserve"> let components react automatically to state changes; </w:t>
       </w:r>
       <w:proofErr w:type="spellStart"/>
       <w:r>
         <w:rPr>
           <w:lang w:val="en-GB"/>
         </w:rPr>
-        <w:t>LogRepository</w:t>
+        <w:t>RxJS</w:t>
       </w:r>
       <w:proofErr w:type="spellEnd"/>
       <w:r>
         <w:rPr>
           <w:lang w:val="en-GB"/>
         </w:rPr>
-        <w:t xml:space="preserve">, </w:t>
-      </w:r>
-      <w:proofErr w:type="spellStart"/>
-      <w:r>
-        <w:rPr>
-          <w:lang w:val="en-GB"/>
-        </w:rPr>
-        <w:t>UserRepository</w:t>
-      </w:r>
-      <w:proofErr w:type="spellEnd"/>
-      <w:r>
-        <w:rPr>
-          <w:lang w:val="en-GB"/>
-        </w:rPr>
-        <w:t xml:space="preserve">). </w:t>
+        <w:t xml:space="preserve"> Observables handle asynchronous backend calls. </w:t>
       </w:r>
     </w:p>
     <w:p>
@@ -2235,103 +2430,82 @@
           <w:bCs/>
           <w:lang w:val="en-GB"/>
         </w:rPr>
-        <w:t>Observer Pattern:</w:t>
-      </w:r>
-      <w:r>
-        <w:rPr>
-          <w:lang w:val="en-GB"/>
-        </w:rPr>
-        <w:t xml:space="preserve"> Angular Signals in the </w:t>
+        <w:t>Singleton / Dependency Injection:</w:t>
+      </w:r>
+      <w:r>
+        <w:rPr>
+          <w:lang w:val="en-GB"/>
+        </w:rPr>
+        <w:t xml:space="preserve"> Spring beans (backend) and Angular services with </w:t>
       </w:r>
       <w:proofErr w:type="spellStart"/>
       <w:r>
         <w:rPr>
           <w:lang w:val="en-GB"/>
         </w:rPr>
-        <w:t>AppStateService</w:t>
+        <w:t>providedIn</w:t>
       </w:r>
       <w:proofErr w:type="spellEnd"/>
       <w:r>
         <w:rPr>
           <w:lang w:val="en-GB"/>
         </w:rPr>
-        <w:t xml:space="preserve"> let components react automatically to state changes; </w:t>
-      </w:r>
-      <w:proofErr w:type="spellStart"/>
-      <w:r>
-        <w:rPr>
-          <w:lang w:val="en-GB"/>
-        </w:rPr>
-        <w:t>RxJS</w:t>
-      </w:r>
-      <w:proofErr w:type="spellEnd"/>
-      <w:r>
-        <w:rPr>
-          <w:lang w:val="en-GB"/>
-        </w:rPr>
-        <w:t xml:space="preserve"> Observables handle asynchronous backend calls. </w:t>
-      </w:r>
-    </w:p>
-    <w:p>
-      <w:pPr>
-        <w:rPr>
-          <w:lang w:val="en-GB"/>
-        </w:rPr>
-      </w:pPr>
+        <w:t>: 'root' (frontend) are singletons distributed via constructor injection.</w:t>
+      </w:r>
+    </w:p>
+    <w:p>
+      <w:pPr>
+        <w:pStyle w:val="berschrift1"/>
+        <w:rPr>
+          <w:lang w:val="en-US"/>
+        </w:rPr>
+      </w:pPr>
+      <w:r>
+        <w:rPr>
+          <w:lang w:val="en-US"/>
+        </w:rPr>
+        <w:t>Library Decisions</w:t>
+      </w:r>
+    </w:p>
+    <w:p>
+      <w:pPr>
+        <w:rPr>
+          <w:lang w:val="en-GB"/>
+        </w:rPr>
+      </w:pPr>
+      <w:r>
+        <w:rPr>
+          <w:lang w:val="en-GB"/>
+        </w:rPr>
+        <w:t xml:space="preserve">The backend uses </w:t>
+      </w:r>
       <w:r>
         <w:rPr>
           <w:b/>
           <w:bCs/>
           <w:lang w:val="en-GB"/>
         </w:rPr>
-        <w:t>Singleton / Dependency Injection:</w:t>
-      </w:r>
-      <w:r>
-        <w:rPr>
-          <w:lang w:val="en-GB"/>
-        </w:rPr>
-        <w:t xml:space="preserve"> Spring beans (backend) and Angular services with </w:t>
-      </w:r>
-      <w:proofErr w:type="spellStart"/>
-      <w:r>
-        <w:rPr>
-          <w:lang w:val="en-GB"/>
-        </w:rPr>
-        <w:t>providedIn</w:t>
-      </w:r>
-      <w:proofErr w:type="spellEnd"/>
-      <w:r>
-        <w:rPr>
-          <w:lang w:val="en-GB"/>
-        </w:rPr>
-        <w:t>: 'root' (frontend) are singletons distributed via constructor injection.</w:t>
-      </w:r>
-    </w:p>
-    <w:p>
-      <w:pPr>
-        <w:pStyle w:val="berschrift1"/>
-        <w:rPr>
-          <w:lang w:val="en-US"/>
-        </w:rPr>
-      </w:pPr>
-      <w:r>
-        <w:rPr>
-          <w:lang w:val="en-US"/>
-        </w:rPr>
-        <w:t>Library Decisions</w:t>
-      </w:r>
-    </w:p>
-    <w:p>
-      <w:pPr>
-        <w:rPr>
-          <w:lang w:val="en-GB"/>
-        </w:rPr>
-      </w:pPr>
-      <w:r>
-        <w:rPr>
-          <w:lang w:val="en-GB"/>
-        </w:rPr>
-        <w:t xml:space="preserve">The backend uses </w:t>
+        <w:t>Spring Boot</w:t>
+      </w:r>
+      <w:r>
+        <w:rPr>
+          <w:lang w:val="en-GB"/>
+        </w:rPr>
+        <w:t xml:space="preserve"> as the main application framework because it provides a structured and efficient way to build REST APIs. spring-boot-starter-web was chosen for implementing controllers and HTTP endpoints.</w:t>
+      </w:r>
+    </w:p>
+    <w:p>
+      <w:pPr>
+        <w:rPr>
+          <w:lang w:val="en-GB"/>
+        </w:rPr>
+      </w:pPr>
+      <w:r>
+        <w:rPr>
+          <w:lang w:val="en-GB"/>
+        </w:rPr>
+        <w:lastRenderedPageBreak/>
+        <w:t xml:space="preserve">For persistence, </w:t>
       </w:r>
       <w:r>
         <w:rPr>
@@ -2339,26 +2513,13 @@
           <w:bCs/>
           <w:lang w:val="en-GB"/>
         </w:rPr>
-        <w:t>Spring Boot</w:t>
-      </w:r>
-      <w:r>
-        <w:rPr>
-          <w:lang w:val="en-GB"/>
-        </w:rPr>
-        <w:t xml:space="preserve"> as the main application framework because it provides a structured and efficient way to build REST APIs. spring-boot-starter-web was chosen for implementing controllers and HTTP endpoints.</w:t>
-      </w:r>
-    </w:p>
-    <w:p>
-      <w:pPr>
-        <w:rPr>
-          <w:lang w:val="en-GB"/>
-        </w:rPr>
-      </w:pPr>
-      <w:r>
-        <w:rPr>
-          <w:lang w:val="en-GB"/>
-        </w:rPr>
-        <w:t xml:space="preserve">For persistence, </w:t>
+        <w:t>Spring Data JPA</w:t>
+      </w:r>
+      <w:r>
+        <w:rPr>
+          <w:lang w:val="en-GB"/>
+        </w:rPr>
+        <w:t xml:space="preserve"> with </w:t>
       </w:r>
       <w:r>
         <w:rPr>
@@ -2366,13 +2527,13 @@
           <w:bCs/>
           <w:lang w:val="en-GB"/>
         </w:rPr>
-        <w:t>Spring Data JPA</w:t>
-      </w:r>
-      <w:r>
-        <w:rPr>
-          <w:lang w:val="en-GB"/>
-        </w:rPr>
-        <w:t xml:space="preserve"> with </w:t>
+        <w:t>Hibernate</w:t>
+      </w:r>
+      <w:r>
+        <w:rPr>
+          <w:lang w:val="en-GB"/>
+        </w:rPr>
+        <w:t xml:space="preserve"> is used. This allows entities such as users, tours, routes, and logs to be mapped to database tables with less manual SQL code. </w:t>
       </w:r>
       <w:r>
         <w:rPr>
@@ -2380,82 +2541,68 @@
           <w:bCs/>
           <w:lang w:val="en-GB"/>
         </w:rPr>
-        <w:t>Hibernate</w:t>
-      </w:r>
-      <w:r>
-        <w:rPr>
-          <w:lang w:val="en-GB"/>
-        </w:rPr>
-        <w:t xml:space="preserve"> is used. This allows entities such as users, tours, routes, and logs to be mapped to database tables with less manual SQL code. </w:t>
-      </w:r>
+        <w:t>PostgreSQL</w:t>
+      </w:r>
+      <w:r>
+        <w:rPr>
+          <w:lang w:val="en-GB"/>
+        </w:rPr>
+        <w:t xml:space="preserve"> was selected as the relational database because it is reliable and well suited for structured application data.</w:t>
+      </w:r>
+    </w:p>
+    <w:p>
+      <w:pPr>
+        <w:rPr>
+          <w:lang w:val="en-GB"/>
+        </w:rPr>
+      </w:pPr>
       <w:r>
         <w:rPr>
           <w:b/>
           <w:bCs/>
           <w:lang w:val="en-GB"/>
         </w:rPr>
-        <w:t>PostgreSQL</w:t>
-      </w:r>
-      <w:r>
-        <w:rPr>
-          <w:lang w:val="en-GB"/>
-        </w:rPr>
-        <w:t xml:space="preserve"> was selected as the relational database because it is reliable and well suited for structured application data.</w:t>
-      </w:r>
-    </w:p>
-    <w:p>
-      <w:pPr>
-        <w:rPr>
-          <w:lang w:val="en-GB"/>
-        </w:rPr>
-      </w:pPr>
+        <w:t>Jackson JSR310</w:t>
+      </w:r>
+      <w:r>
+        <w:rPr>
+          <w:lang w:val="en-GB"/>
+        </w:rPr>
+        <w:t xml:space="preserve"> was added to properly serialize and deserialize Java date and time types, such as </w:t>
+      </w:r>
+      <w:proofErr w:type="spellStart"/>
+      <w:r>
+        <w:rPr>
+          <w:lang w:val="en-GB"/>
+        </w:rPr>
+        <w:t>LocalDateTime</w:t>
+      </w:r>
+      <w:proofErr w:type="spellEnd"/>
+      <w:r>
+        <w:rPr>
+          <w:lang w:val="en-GB"/>
+        </w:rPr>
+        <w:t>.</w:t>
+      </w:r>
+    </w:p>
+    <w:p>
+      <w:pPr>
+        <w:rPr>
+          <w:lang w:val="en-GB"/>
+        </w:rPr>
+      </w:pPr>
+      <w:r>
+        <w:rPr>
+          <w:lang w:val="en-GB"/>
+        </w:rPr>
+        <w:t xml:space="preserve">For validation, </w:t>
+      </w:r>
       <w:r>
         <w:rPr>
           <w:b/>
           <w:bCs/>
           <w:lang w:val="en-GB"/>
         </w:rPr>
-        <w:t>Jackson JSR310</w:t>
-      </w:r>
-      <w:r>
-        <w:rPr>
-          <w:lang w:val="en-GB"/>
-        </w:rPr>
-        <w:t xml:space="preserve"> was added to properly serialize and deserialize Java date and time types, such as </w:t>
-      </w:r>
-      <w:proofErr w:type="spellStart"/>
-      <w:r>
-        <w:rPr>
-          <w:lang w:val="en-GB"/>
-        </w:rPr>
-        <w:t>LocalDateTime</w:t>
-      </w:r>
-      <w:proofErr w:type="spellEnd"/>
-      <w:r>
-        <w:rPr>
-          <w:lang w:val="en-GB"/>
-        </w:rPr>
-        <w:t>.</w:t>
-      </w:r>
-    </w:p>
-    <w:p>
-      <w:pPr>
-        <w:rPr>
-          <w:lang w:val="en-GB"/>
-        </w:rPr>
-      </w:pPr>
-      <w:r>
-        <w:rPr>
-          <w:lang w:val="en-GB"/>
-        </w:rPr>
-        <w:t xml:space="preserve">For validation, </w:t>
-      </w:r>
-      <w:r>
-        <w:rPr>
-          <w:b/>
-          <w:bCs/>
-          <w:lang w:val="en-GB"/>
-        </w:rPr>
         <w:t>Hibernate Validator</w:t>
       </w:r>
       <w:r>
@@ -2475,7 +2622,6 @@
         <w:rPr>
           <w:lang w:val="en-GB"/>
         </w:rPr>
-        <w:lastRenderedPageBreak/>
         <w:t xml:space="preserve">The project uses </w:t>
       </w:r>
       <w:r>
@@ -2683,38 +2829,6 @@
     </w:p>
     <w:p>
       <w:pPr>
-        <w:pStyle w:val="Listenabsatz"/>
-        <w:numPr>
-          <w:ilvl w:val="0"/>
-          <w:numId w:val="3"/>
-        </w:numPr>
-        <w:rPr>
-          <w:color w:val="EE0000"/>
-        </w:rPr>
-      </w:pPr>
-      <w:r>
-        <w:rPr>
-          <w:color w:val="EE0000"/>
-        </w:rPr>
-        <w:t xml:space="preserve">neues erstellen mit Front End und </w:t>
-      </w:r>
-      <w:proofErr w:type="gramStart"/>
-      <w:r>
-        <w:rPr>
-          <w:color w:val="EE0000"/>
-        </w:rPr>
-        <w:t>Backend</w:t>
-      </w:r>
-      <w:proofErr w:type="gramEnd"/>
-      <w:r>
-        <w:rPr>
-          <w:color w:val="EE0000"/>
-        </w:rPr>
-        <w:t>??</w:t>
-      </w:r>
-    </w:p>
-    <w:p>
-      <w:pPr>
         <w:pStyle w:val="berschrift1"/>
         <w:rPr>
           <w:lang w:val="en-US"/>
@@ -2724,6 +2838,7 @@
         <w:rPr>
           <w:lang w:val="en-US"/>
         </w:rPr>
+        <w:lastRenderedPageBreak/>
         <w:t xml:space="preserve">UX </w:t>
       </w:r>
     </w:p>
@@ -2793,7 +2908,6 @@
         <w:rPr>
           <w:lang w:val="en-US"/>
         </w:rPr>
-        <w:lastRenderedPageBreak/>
         <w:t>Personas</w:t>
       </w:r>
     </w:p>
@@ -3648,7 +3762,7 @@
         </w:rPr>
         <w:lastRenderedPageBreak/>
         <w:drawing>
-          <wp:anchor distT="0" distB="0" distL="114300" distR="114300" simplePos="0" relativeHeight="251662336" behindDoc="0" locked="0" layoutInCell="1" allowOverlap="1" wp14:anchorId="40BCD063" wp14:editId="1548CFAD">
+          <wp:anchor distT="0" distB="0" distL="114300" distR="114300" simplePos="0" relativeHeight="251662336" behindDoc="0" locked="0" layoutInCell="1" allowOverlap="1" wp14:anchorId="40BCD063" wp14:editId="0DD67705">
             <wp:simplePos x="0" y="0"/>
             <wp:positionH relativeFrom="column">
               <wp:posOffset>-4445</wp:posOffset>
@@ -5944,6 +6058,7 @@
   <w:style w:type="character" w:default="1" w:styleId="Absatz-Standardschriftart">
     <w:name w:val="Default Paragraph Font"/>
     <w:uiPriority w:val="1"/>
+    <w:semiHidden/>
     <w:unhideWhenUsed/>
   </w:style>
   <w:style w:type="table" w:default="1" w:styleId="NormaleTabelle">

</xml_diff>